<commit_message>
Actualización de documentos, considerando cambios realizados en Google Drive
</commit_message>
<xml_diff>
--- a/Fase 2/Evidencias Proyecto/Evidencias de documentación/1.2 Sprint Planning/1.2.1 Hoja de ruta del proyecto.docx
+++ b/Fase 2/Evidencias Proyecto/Evidencias de documentación/1.2 Sprint Planning/1.2.1 Hoja de ruta del proyecto.docx
@@ -2464,7 +2464,19 @@
               <w:rPr>
                 <w:rtl w:val="0"/>
               </w:rPr>
-              <w:t xml:space="preserve">Wireframes o Mockups; Diagrama UML; Especificación de Herramientas y Servicios del Proyecto; Arquitectura</w:t>
+              <w:t xml:space="preserve">Wireframes </w:t>
+            </w:r>
+            <w:r>
+              <w:rPr>
+                <w:rtl w:val="0"/>
+              </w:rPr>
+              <w:t xml:space="preserve">o Mockups</w:t>
+            </w:r>
+            <w:r>
+              <w:rPr>
+                <w:rtl w:val="0"/>
+              </w:rPr>
+              <w:t xml:space="preserve">; Diagrama UML; Especificación de Herramientas y Servicios del Proyecto; Arquitectura</w:t>
             </w:r>
           </w:p>
         </w:tc>
@@ -2716,7 +2728,7 @@
           <w:color w:val="1f1f1f"/>
           <w:rtl w:val="0"/>
         </w:rPr>
-        <w:t xml:space="preserve">La distribución de PBIs en la línea de tiempo semanal se rige estrictamente por los siguientes 7 criterios de ingeniería de software y agilidad:</w:t>
+        <w:t xml:space="preserve">La distribución de PBIs en la línea de tiempo semanal se rige estrictamente por los siguientes 6 criterios de ingeniería de software y agilidad:</w:t>
       </w:r>
     </w:p>
     <w:p>
@@ -3840,7 +3852,7 @@
           <w:color w:val="1f1f1f"/>
           <w:rtl w:val="0"/>
         </w:rPr>
-        <w:t xml:space="preserve"> La asignación de Story Points respeta las limitaciones de tiempo de un equipo de dos Developers en un entorno universitario, evitando la sobrecarga de trabajo y la degradación de la calidad.</w:t>
+        <w:t xml:space="preserve"> La asignación de Story Points respeta las limitaciones de tiempo de un equipo de tres Developers en un entorno universitario, evitando la sobrecarga de trabajo y la degradación de la calidad.</w:t>
       </w:r>
     </w:p>
     <w:p>

</xml_diff>

<commit_message>
Actualización de documentación, incorporación de cambios a fecha (10/10/2026), actualización de 4.4 Docker
</commit_message>
<xml_diff>
--- a/Fase 2/Evidencias Proyecto/Evidencias de documentación/1.2 Sprint Planning/1.2.1 Hoja de ruta del proyecto.docx
+++ b/Fase 2/Evidencias Proyecto/Evidencias de documentación/1.2 Sprint Planning/1.2.1 Hoja de ruta del proyecto.docx
@@ -170,7 +170,7 @@
           <w:color w:val="1f1f1f"/>
           <w:rtl w:val="0"/>
         </w:rPr>
-        <w:t xml:space="preserve">Con este plan se espera una proyección macro que agrupa las Historias de Usuario del Product Backlog en iteraciones de una semana, estableciendo un camino probable para alcanzar el </w:t>
+        <w:t xml:space="preserve">Con este plan se espera una proyección macro que agrupa las Historias de Usuario del Product Backlog en iteraciones de una semana (exceptuando el Sprint 4 correspondiente a la Fase 1 que tiene una duración de dos semanas y los Sprints de Fase 2 que pueden extenderse dependiendo de su Sprint Planning) , estableciendo un camino probable para alcanzar el </w:t>
       </w:r>
       <w:r>
         <w:rPr>
@@ -361,7 +361,7 @@
           <w:color w:val="1f1f1f"/>
           <w:rtl w:val="0"/>
         </w:rPr>
-        <w:t xml:space="preserve">Garantizar el enfoque prioritario en las 8 Historias de Usuario pertenecientes al MVP.</w:t>
+        <w:t xml:space="preserve">Garantizar el enfoque prioritario en las 9 Historias de Usuario pertenecientes al MVP.</w:t>
       </w:r>
     </w:p>
     <w:p>
@@ -1532,7 +1532,7 @@
           <w:color w:val="1f1f1f"/>
           <w:rtl w:val="0"/>
         </w:rPr>
-        <w:t xml:space="preserve"> 8 HUs.</w:t>
+        <w:t xml:space="preserve"> 9 HUs.</w:t>
       </w:r>
       <w:r>
         <w:rPr>
@@ -1717,7 +1717,7 @@
           <w:color w:val="1f1f1f"/>
           <w:rtl w:val="0"/>
         </w:rPr>
-        <w:t xml:space="preserve"> no poseen dependencias directas entre sí y pueden ser asumidas de manera simultánea por los dos Developers una vez completada la </w:t>
+        <w:t xml:space="preserve"> no poseen dependencias directas entre sí y pueden ser asumidas de manera simultánea por dos de los tres Developers una vez completada la </w:t>
       </w:r>
       <w:r>
         <w:rPr>
@@ -2787,7 +2787,7 @@
           <w:color w:val="1f1f1f"/>
           <w:rtl w:val="0"/>
         </w:rPr>
-        <w:t xml:space="preserve"> son absorbidos en los Sprints 1 al 4.</w:t>
+        <w:t xml:space="preserve"> se desarrollan en los primeros Sprints de la Fase 2. Los Sprints 1 al 4 de la Fase 1 establecen la base documental y técnica del proyecto.</w:t>
       </w:r>
     </w:p>
     <w:p>
@@ -3805,23 +3805,7 @@
           <w:color w:val="1f1f1f"/>
           <w:rtl w:val="0"/>
         </w:rPr>
-        <w:t xml:space="preserve"> La consecución del MVP en el </w:t>
-      </w:r>
-      <w:r>
-        <w:rPr>
-          <w:b w:val="1"/>
-          <w:bCs w:val="1"/>
-          <w:color w:val="1f1f1f"/>
-          <w:rtl w:val="0"/>
-        </w:rPr>
-        <w:t xml:space="preserve">Sprint 4</w:t>
-      </w:r>
-      <w:r>
-        <w:rPr>
-          <w:color w:val="1f1f1f"/>
-          <w:rtl w:val="0"/>
-        </w:rPr>
-        <w:t xml:space="preserve"> mitiga el riesgo académico de llegar al final del proceso de titulación sin un producto funcional demostrable.</w:t>
+        <w:t xml:space="preserve"> La consecución temprana del MVP en la Fase 2 (9 HUs: HU-01 a HU-08 y HU-14), preparada con la línea base entregada en el Sprint 4 de la Fase 1, mitiga el riesgo académico de llegar al proceso final sin un producto funcional demostrable.</w:t>
       </w:r>
     </w:p>
     <w:p>

</xml_diff>

<commit_message>
actualizar archivos del drive
fueron subidos los documentos del drive
</commit_message>
<xml_diff>
--- a/Fase 2/Evidencias Proyecto/Evidencias de documentación/1.2 Sprint Planning/1.2.1 Hoja de ruta del proyecto.docx
+++ b/Fase 2/Evidencias Proyecto/Evidencias de documentación/1.2 Sprint Planning/1.2.1 Hoja de ruta del proyecto.docx
@@ -170,7 +170,7 @@
           <w:color w:val="1f1f1f"/>
           <w:rtl w:val="0"/>
         </w:rPr>
-        <w:t xml:space="preserve">Con este plan se espera una proyección macro que agrupa las Historias de Usuario del Product Backlog en iteraciones de una semana, estableciendo un camino probable para alcanzar el </w:t>
+        <w:t xml:space="preserve">Con este plan se espera una proyección macro que agrupa las Historias de Usuario del Product Backlog en iteraciones de una semana (exceptuando el Sprint 4 correspondiente a la Fase 1 que tiene una duración de dos semanas y los Sprints de Fase 2 que pueden extenderse dependiendo de su Sprint Planning) , estableciendo un camino probable para alcanzar el </w:t>
       </w:r>
       <w:r>
         <w:rPr>
@@ -361,7 +361,7 @@
           <w:color w:val="1f1f1f"/>
           <w:rtl w:val="0"/>
         </w:rPr>
-        <w:t xml:space="preserve">Garantizar el enfoque prioritario en las 8 Historias de Usuario pertenecientes al MVP.</w:t>
+        <w:t xml:space="preserve">Garantizar el enfoque prioritario en las 9 Historias de Usuario pertenecientes al MVP.</w:t>
       </w:r>
     </w:p>
     <w:p>
@@ -1532,7 +1532,7 @@
           <w:color w:val="1f1f1f"/>
           <w:rtl w:val="0"/>
         </w:rPr>
-        <w:t xml:space="preserve"> 8 HUs.</w:t>
+        <w:t xml:space="preserve"> 9 HUs.</w:t>
       </w:r>
       <w:r>
         <w:rPr>
@@ -1717,7 +1717,7 @@
           <w:color w:val="1f1f1f"/>
           <w:rtl w:val="0"/>
         </w:rPr>
-        <w:t xml:space="preserve"> no poseen dependencias directas entre sí y pueden ser asumidas de manera simultánea por los dos Developers una vez completada la </w:t>
+        <w:t xml:space="preserve"> no poseen dependencias directas entre sí y pueden ser asumidas de manera simultánea por dos de los tres Developers una vez completada la </w:t>
       </w:r>
       <w:r>
         <w:rPr>
@@ -2464,7 +2464,19 @@
               <w:rPr>
                 <w:rtl w:val="0"/>
               </w:rPr>
-              <w:t xml:space="preserve">Wireframes o Mockups; Diagrama UML; Especificación de Herramientas y Servicios del Proyecto; Arquitectura</w:t>
+              <w:t xml:space="preserve">Wireframes </w:t>
+            </w:r>
+            <w:r>
+              <w:rPr>
+                <w:rtl w:val="0"/>
+              </w:rPr>
+              <w:t xml:space="preserve">o Mockups</w:t>
+            </w:r>
+            <w:r>
+              <w:rPr>
+                <w:rtl w:val="0"/>
+              </w:rPr>
+              <w:t xml:space="preserve">; Diagrama UML; Especificación de Herramientas y Servicios del Proyecto; Arquitectura</w:t>
             </w:r>
           </w:p>
         </w:tc>
@@ -2716,7 +2728,7 @@
           <w:color w:val="1f1f1f"/>
           <w:rtl w:val="0"/>
         </w:rPr>
-        <w:t xml:space="preserve">La distribución de PBIs en la línea de tiempo semanal se rige estrictamente por los siguientes 7 criterios de ingeniería de software y agilidad:</w:t>
+        <w:t xml:space="preserve">La distribución de PBIs en la línea de tiempo semanal se rige estrictamente por los siguientes 6 criterios de ingeniería de software y agilidad:</w:t>
       </w:r>
     </w:p>
     <w:p>
@@ -2775,7 +2787,7 @@
           <w:color w:val="1f1f1f"/>
           <w:rtl w:val="0"/>
         </w:rPr>
-        <w:t xml:space="preserve"> son absorbidos en los Sprints 1 al 4.</w:t>
+        <w:t xml:space="preserve"> se desarrollan en los primeros Sprints de la Fase 2. Los Sprints 1 al 4 de la Fase 1 establecen la base documental y técnica del proyecto.</w:t>
       </w:r>
     </w:p>
     <w:p>
@@ -3793,23 +3805,7 @@
           <w:color w:val="1f1f1f"/>
           <w:rtl w:val="0"/>
         </w:rPr>
-        <w:t xml:space="preserve"> La consecución del MVP en el </w:t>
-      </w:r>
-      <w:r>
-        <w:rPr>
-          <w:b w:val="1"/>
-          <w:bCs w:val="1"/>
-          <w:color w:val="1f1f1f"/>
-          <w:rtl w:val="0"/>
-        </w:rPr>
-        <w:t xml:space="preserve">Sprint 4</w:t>
-      </w:r>
-      <w:r>
-        <w:rPr>
-          <w:color w:val="1f1f1f"/>
-          <w:rtl w:val="0"/>
-        </w:rPr>
-        <w:t xml:space="preserve"> mitiga el riesgo académico de llegar al final del proceso de titulación sin un producto funcional demostrable.</w:t>
+        <w:t xml:space="preserve"> La consecución temprana del MVP en la Fase 2 (9 HUs: HU-01 a HU-08 y HU-14), preparada con la línea base entregada en el Sprint 4 de la Fase 1, mitiga el riesgo académico de llegar al proceso final sin un producto funcional demostrable.</w:t>
       </w:r>
     </w:p>
     <w:p>
@@ -3840,7 +3836,7 @@
           <w:color w:val="1f1f1f"/>
           <w:rtl w:val="0"/>
         </w:rPr>
-        <w:t xml:space="preserve"> La asignación de Story Points respeta las limitaciones de tiempo de un equipo de dos Developers en un entorno universitario, evitando la sobrecarga de trabajo y la degradación de la calidad.</w:t>
+        <w:t xml:space="preserve"> La asignación de Story Points respeta las limitaciones de tiempo de un equipo de tres Developers en un entorno universitario, evitando la sobrecarga de trabajo y la degradación de la calidad.</w:t>
       </w:r>
     </w:p>
     <w:p>

</xml_diff>

<commit_message>
arreglo de [ERR-12] Errores de planificación (sprints, fechas y backlog)
</commit_message>
<xml_diff>
--- a/Fase 2/Evidencias Proyecto/Evidencias de documentación/1.2 Sprint Planning/1.2.1 Hoja de ruta del proyecto.docx
+++ b/Fase 2/Evidencias Proyecto/Evidencias de documentación/1.2 Sprint Planning/1.2.1 Hoja de ruta del proyecto.docx
@@ -3131,6 +3131,30 @@
     </w:p>
     <w:p>
       <w:pPr>
+        <w:pBdr>
+          <w:top w:color="auto" w:space="0" w:sz="0" w:val="none"/>
+          <w:left w:color="auto" w:space="0" w:sz="0" w:val="none"/>
+          <w:bottom w:color="auto" w:space="0" w:sz="0" w:val="none"/>
+          <w:right w:color="auto" w:space="0" w:sz="0" w:val="none"/>
+          <w:between w:color="auto" w:space="0" w:sz="0" w:val="none"/>
+        </w:pBdr>
+        <w:shd w:fill="ffffff" w:val="clear"/>
+        <w:spacing w:after="100" w:line="259.20000000000005" w:lineRule="auto"/>
+        <w:ind w:left="0" w:firstLine="0"/>
+        <w:rPr>
+          <w:color w:val="1f1f1f"/>
+        </w:rPr>
+      </w:pPr>
+      <w:r>
+        <w:rPr>
+          <w:color w:val="1f1f1f"/>
+          <w:rtl w:val="0"/>
+        </w:rPr>
+        <w:t>Esta Definition of Done es única para el proyecto: se aplica a todas las tarjetas y entregables de la Fase 1 y la Fase 2.</w:t>
+      </w:r>
+    </w:p>
+    <w:p>
+      <w:pPr>
         <w:keepNext w:val="0"/>
         <w:keepLines w:val="0"/>
         <w:pageBreakBefore w:val="0"/>
@@ -3152,15 +3176,14 @@
         <w:jc w:val="left"/>
         <w:rPr>
           <w:color w:val="1f1f1f"/>
-          <w:u w:val="none"/>
-        </w:rPr>
-      </w:pPr>
-      <w:r>
-        <w:rPr>
-          <w:color w:val="1f1f1f"/>
-          <w:rtl w:val="0"/>
-        </w:rPr>
-        <w:t xml:space="preserve">Los criterios de aceptación de los PBI seleccionados están cumplidos y verificados.</w:t>
+        </w:rPr>
+      </w:pPr>
+      <w:r>
+        <w:rPr>
+          <w:color w:val="1f1f1f"/>
+          <w:rtl w:val="0"/>
+        </w:rPr>
+        <w:t xml:space="preserve">El entregable está completo </w:t>
       </w:r>
     </w:p>
     <w:p>
@@ -3186,15 +3209,14 @@
         <w:jc w:val="left"/>
         <w:rPr>
           <w:color w:val="1f1f1f"/>
-          <w:u w:val="none"/>
-        </w:rPr>
-      </w:pPr>
-      <w:r>
-        <w:rPr>
-          <w:color w:val="1f1f1f"/>
-          <w:rtl w:val="0"/>
-        </w:rPr>
-        <w:t xml:space="preserve">El código o documento está versionado y revisado por otro integrante.</w:t>
+        </w:rPr>
+      </w:pPr>
+      <w:r>
+        <w:rPr>
+          <w:color w:val="1f1f1f"/>
+          <w:rtl w:val="0"/>
+        </w:rPr>
+        <w:t xml:space="preserve">Los criterios de aceptación aplicables fueron revisados y cumplidos.</w:t>
       </w:r>
     </w:p>
     <w:p>
@@ -3220,15 +3242,14 @@
         <w:jc w:val="left"/>
         <w:rPr>
           <w:color w:val="1f1f1f"/>
-          <w:u w:val="none"/>
-        </w:rPr>
-      </w:pPr>
-      <w:r>
-        <w:rPr>
-          <w:color w:val="1f1f1f"/>
-          <w:rtl w:val="0"/>
-        </w:rPr>
-        <w:t xml:space="preserve">Las pruebas pertinentes están aprobadas y no existen defectos críticos conocidos.</w:t>
+        </w:rPr>
+      </w:pPr>
+      <w:r>
+        <w:rPr>
+          <w:color w:val="1f1f1f"/>
+          <w:rtl w:val="0"/>
+        </w:rPr>
+        <w:t xml:space="preserve">El documento, diagrama o configuración fue revisado por otro integrante.</w:t>
       </w:r>
     </w:p>
     <w:p>
@@ -3254,15 +3275,14 @@
         <w:jc w:val="left"/>
         <w:rPr>
           <w:color w:val="1f1f1f"/>
-          <w:u w:val="none"/>
-        </w:rPr>
-      </w:pPr>
-      <w:r>
-        <w:rPr>
-          <w:color w:val="1f1f1f"/>
-          <w:rtl w:val="0"/>
-        </w:rPr>
-        <w:t xml:space="preserve">La documentación, trazabilidad, riesgos y evidencias fueron actualizados.</w:t>
+        </w:rPr>
+      </w:pPr>
+      <w:r>
+        <w:rPr>
+          <w:color w:val="1f1f1f"/>
+          <w:rtl w:val="0"/>
+        </w:rPr>
+        <w:t xml:space="preserve">La evidencia se encuentra adjunta o vinculada desde la tarjeta correspondiente.</w:t>
       </w:r>
     </w:p>
     <w:p>
@@ -3288,15 +3308,14 @@
         <w:jc w:val="left"/>
         <w:rPr>
           <w:color w:val="1f1f1f"/>
-          <w:u w:val="none"/>
-        </w:rPr>
-      </w:pPr>
-      <w:r>
-        <w:rPr>
-          <w:color w:val="1f1f1f"/>
-          <w:rtl w:val="0"/>
-        </w:rPr>
-        <w:t xml:space="preserve">No se exponen contraseñas, tokens, datos médicos ni ubicaciones sin autorización.</w:t>
+        </w:rPr>
+      </w:pPr>
+      <w:r>
+        <w:rPr>
+          <w:color w:val="1f1f1f"/>
+          <w:rtl w:val="0"/>
+        </w:rPr>
+        <w:t xml:space="preserve">No existen errores críticos pendientes que impidan presentar el resultado.</w:t>
       </w:r>
     </w:p>
     <w:p>
@@ -3322,44 +3341,14 @@
         <w:jc w:val="left"/>
         <w:rPr>
           <w:color w:val="1f1f1f"/>
-          <w:u w:val="none"/>
-        </w:rPr>
-      </w:pPr>
-      <w:r>
-        <w:rPr>
-          <w:color w:val="1f1f1f"/>
-          <w:rtl w:val="0"/>
-        </w:rPr>
-        <w:t xml:space="preserve">El incremento puede presentarse en la Sprint Review y ser inspeccionado por el Product Owner.</w:t>
-      </w:r>
-      <w:r>
-        <w:rPr>
-          <w:rtl w:val="0"/>
-        </w:rPr>
-      </w:r>
-    </w:p>
-    <w:p>
-      <w:pPr>
-        <w:pBdr>
-          <w:top w:color="auto" w:space="0" w:sz="0" w:val="none"/>
-          <w:left w:color="auto" w:space="0" w:sz="0" w:val="none"/>
-          <w:bottom w:color="auto" w:space="0" w:sz="0" w:val="none"/>
-          <w:right w:color="auto" w:space="0" w:sz="0" w:val="none"/>
-          <w:between w:color="auto" w:space="0" w:sz="0" w:val="none"/>
-        </w:pBdr>
-        <w:shd w:fill="ffffff" w:val="clear"/>
-        <w:spacing w:after="100" w:line="259.20000000000005" w:lineRule="auto"/>
-        <w:ind w:left="0" w:firstLine="0"/>
-        <w:rPr>
-          <w:color w:val="1f1f1f"/>
-        </w:rPr>
-      </w:pPr>
-      <w:r>
-        <w:rPr>
-          <w:color w:val="1f1f1f"/>
-          <w:rtl w:val="0"/>
-        </w:rPr>
-        <w:t xml:space="preserve">La siguiente definición se aplica a todas las tarjetas y entregables de los cuatro Sprints.</w:t>
+        </w:rPr>
+      </w:pPr>
+      <w:r>
+        <w:rPr>
+          <w:color w:val="1f1f1f"/>
+          <w:rtl w:val="0"/>
+        </w:rPr>
+        <w:t xml:space="preserve">La documentación y la trazabilidad relacionadas fueron actualizadas.</w:t>
       </w:r>
     </w:p>
     <w:p>
@@ -3392,7 +3381,7 @@
           <w:color w:val="1f1f1f"/>
           <w:rtl w:val="0"/>
         </w:rPr>
-        <w:t xml:space="preserve">El entregable está completo </w:t>
+        <w:t xml:space="preserve">El resultado puede demostrarse en la Sprint Review y ser inspeccionado por el Product Owner.</w:t>
       </w:r>
     </w:p>
     <w:p>
@@ -3425,204 +3414,6 @@
           <w:color w:val="1f1f1f"/>
           <w:rtl w:val="0"/>
         </w:rPr>
-        <w:t xml:space="preserve">Los criterios de aceptación aplicables fueron revisados y cumplidos.</w:t>
-      </w:r>
-    </w:p>
-    <w:p>
-      <w:pPr>
-        <w:keepNext w:val="0"/>
-        <w:keepLines w:val="0"/>
-        <w:pageBreakBefore w:val="0"/>
-        <w:widowControl w:val="1"/>
-        <w:numPr>
-          <w:ilvl w:val="0"/>
-          <w:numId w:val="1"/>
-        </w:numPr>
-        <w:pBdr>
-          <w:top w:color="auto" w:space="0" w:sz="0" w:val="none"/>
-          <w:left w:space="0" w:sz="0" w:val="nil"/>
-          <w:bottom w:color="auto" w:space="0" w:sz="0" w:val="none"/>
-          <w:right w:color="auto" w:space="0" w:sz="0" w:val="none"/>
-          <w:between w:color="auto" w:space="0" w:sz="0" w:val="none"/>
-        </w:pBdr>
-        <w:shd w:fill="auto" w:val="clear"/>
-        <w:spacing w:after="0" w:before="0" w:line="276" w:lineRule="auto"/>
-        <w:ind w:left="720" w:right="0" w:hanging="360"/>
-        <w:jc w:val="left"/>
-        <w:rPr>
-          <w:color w:val="1f1f1f"/>
-        </w:rPr>
-      </w:pPr>
-      <w:r>
-        <w:rPr>
-          <w:color w:val="1f1f1f"/>
-          <w:rtl w:val="0"/>
-        </w:rPr>
-        <w:t xml:space="preserve">El documento, diagrama o configuración fue revisado por otro integrante.</w:t>
-      </w:r>
-    </w:p>
-    <w:p>
-      <w:pPr>
-        <w:keepNext w:val="0"/>
-        <w:keepLines w:val="0"/>
-        <w:pageBreakBefore w:val="0"/>
-        <w:widowControl w:val="1"/>
-        <w:numPr>
-          <w:ilvl w:val="0"/>
-          <w:numId w:val="1"/>
-        </w:numPr>
-        <w:pBdr>
-          <w:top w:color="auto" w:space="0" w:sz="0" w:val="none"/>
-          <w:left w:space="0" w:sz="0" w:val="nil"/>
-          <w:bottom w:color="auto" w:space="0" w:sz="0" w:val="none"/>
-          <w:right w:color="auto" w:space="0" w:sz="0" w:val="none"/>
-          <w:between w:color="auto" w:space="0" w:sz="0" w:val="none"/>
-        </w:pBdr>
-        <w:shd w:fill="auto" w:val="clear"/>
-        <w:spacing w:after="0" w:before="0" w:line="276" w:lineRule="auto"/>
-        <w:ind w:left="720" w:right="0" w:hanging="360"/>
-        <w:jc w:val="left"/>
-        <w:rPr>
-          <w:color w:val="1f1f1f"/>
-        </w:rPr>
-      </w:pPr>
-      <w:r>
-        <w:rPr>
-          <w:color w:val="1f1f1f"/>
-          <w:rtl w:val="0"/>
-        </w:rPr>
-        <w:t xml:space="preserve">La evidencia se encuentra adjunta o vinculada desde la tarjeta correspondiente.</w:t>
-      </w:r>
-    </w:p>
-    <w:p>
-      <w:pPr>
-        <w:keepNext w:val="0"/>
-        <w:keepLines w:val="0"/>
-        <w:pageBreakBefore w:val="0"/>
-        <w:widowControl w:val="1"/>
-        <w:numPr>
-          <w:ilvl w:val="0"/>
-          <w:numId w:val="1"/>
-        </w:numPr>
-        <w:pBdr>
-          <w:top w:color="auto" w:space="0" w:sz="0" w:val="none"/>
-          <w:left w:space="0" w:sz="0" w:val="nil"/>
-          <w:bottom w:color="auto" w:space="0" w:sz="0" w:val="none"/>
-          <w:right w:color="auto" w:space="0" w:sz="0" w:val="none"/>
-          <w:between w:color="auto" w:space="0" w:sz="0" w:val="none"/>
-        </w:pBdr>
-        <w:shd w:fill="auto" w:val="clear"/>
-        <w:spacing w:after="0" w:before="0" w:line="276" w:lineRule="auto"/>
-        <w:ind w:left="720" w:right="0" w:hanging="360"/>
-        <w:jc w:val="left"/>
-        <w:rPr>
-          <w:color w:val="1f1f1f"/>
-        </w:rPr>
-      </w:pPr>
-      <w:r>
-        <w:rPr>
-          <w:color w:val="1f1f1f"/>
-          <w:rtl w:val="0"/>
-        </w:rPr>
-        <w:t xml:space="preserve">No existen errores críticos pendientes que impidan presentar el resultado.</w:t>
-      </w:r>
-    </w:p>
-    <w:p>
-      <w:pPr>
-        <w:keepNext w:val="0"/>
-        <w:keepLines w:val="0"/>
-        <w:pageBreakBefore w:val="0"/>
-        <w:widowControl w:val="1"/>
-        <w:numPr>
-          <w:ilvl w:val="0"/>
-          <w:numId w:val="1"/>
-        </w:numPr>
-        <w:pBdr>
-          <w:top w:color="auto" w:space="0" w:sz="0" w:val="none"/>
-          <w:left w:space="0" w:sz="0" w:val="nil"/>
-          <w:bottom w:color="auto" w:space="0" w:sz="0" w:val="none"/>
-          <w:right w:color="auto" w:space="0" w:sz="0" w:val="none"/>
-          <w:between w:color="auto" w:space="0" w:sz="0" w:val="none"/>
-        </w:pBdr>
-        <w:shd w:fill="auto" w:val="clear"/>
-        <w:spacing w:after="0" w:before="0" w:line="276" w:lineRule="auto"/>
-        <w:ind w:left="720" w:right="0" w:hanging="360"/>
-        <w:jc w:val="left"/>
-        <w:rPr>
-          <w:color w:val="1f1f1f"/>
-        </w:rPr>
-      </w:pPr>
-      <w:r>
-        <w:rPr>
-          <w:color w:val="1f1f1f"/>
-          <w:rtl w:val="0"/>
-        </w:rPr>
-        <w:t xml:space="preserve">La documentación y la trazabilidad relacionadas fueron actualizadas.</w:t>
-      </w:r>
-    </w:p>
-    <w:p>
-      <w:pPr>
-        <w:keepNext w:val="0"/>
-        <w:keepLines w:val="0"/>
-        <w:pageBreakBefore w:val="0"/>
-        <w:widowControl w:val="1"/>
-        <w:numPr>
-          <w:ilvl w:val="0"/>
-          <w:numId w:val="1"/>
-        </w:numPr>
-        <w:pBdr>
-          <w:top w:color="auto" w:space="0" w:sz="0" w:val="none"/>
-          <w:left w:space="0" w:sz="0" w:val="nil"/>
-          <w:bottom w:color="auto" w:space="0" w:sz="0" w:val="none"/>
-          <w:right w:color="auto" w:space="0" w:sz="0" w:val="none"/>
-          <w:between w:color="auto" w:space="0" w:sz="0" w:val="none"/>
-        </w:pBdr>
-        <w:shd w:fill="auto" w:val="clear"/>
-        <w:spacing w:after="0" w:before="0" w:line="276" w:lineRule="auto"/>
-        <w:ind w:left="720" w:right="0" w:hanging="360"/>
-        <w:jc w:val="left"/>
-        <w:rPr>
-          <w:color w:val="1f1f1f"/>
-        </w:rPr>
-      </w:pPr>
-      <w:r>
-        <w:rPr>
-          <w:color w:val="1f1f1f"/>
-          <w:rtl w:val="0"/>
-        </w:rPr>
-        <w:t xml:space="preserve">El resultado puede demostrarse en la Sprint Review y ser inspeccionado por el Product Owner.</w:t>
-      </w:r>
-    </w:p>
-    <w:p>
-      <w:pPr>
-        <w:keepNext w:val="0"/>
-        <w:keepLines w:val="0"/>
-        <w:pageBreakBefore w:val="0"/>
-        <w:widowControl w:val="1"/>
-        <w:numPr>
-          <w:ilvl w:val="0"/>
-          <w:numId w:val="1"/>
-        </w:numPr>
-        <w:pBdr>
-          <w:top w:color="auto" w:space="0" w:sz="0" w:val="none"/>
-          <w:left w:space="0" w:sz="0" w:val="nil"/>
-          <w:bottom w:color="auto" w:space="0" w:sz="0" w:val="none"/>
-          <w:right w:color="auto" w:space="0" w:sz="0" w:val="none"/>
-          <w:between w:color="auto" w:space="0" w:sz="0" w:val="none"/>
-        </w:pBdr>
-        <w:shd w:fill="auto" w:val="clear"/>
-        <w:spacing w:after="0" w:before="0" w:line="276" w:lineRule="auto"/>
-        <w:ind w:left="720" w:right="0" w:hanging="360"/>
-        <w:jc w:val="left"/>
-        <w:rPr>
-          <w:color w:val="1f1f1f"/>
-        </w:rPr>
-      </w:pPr>
-      <w:r>
-        <w:rPr>
-          <w:color w:val="1f1f1f"/>
-          <w:rtl w:val="0"/>
-        </w:rPr>
         <w:t xml:space="preserve">La tarjeta queda marcada como completada solamente después de la validación correspondiente.</w:t>
       </w:r>
       <w:r>
@@ -3774,7 +3565,7 @@
           <w:color w:val="1f1f1f"/>
           <w:rtl w:val="0"/>
         </w:rPr>
-        <w:t xml:space="preserve"> Establece un horizonte claro de 7 semanas de trabajo donde los roles Scrum (PO, SM y Developers) comprenden el momento en que se entregará cada capacidad del sistema.</w:t>
+        <w:t xml:space="preserve"> Establece un horizonte claro de 5 semanas de trabajo donde los roles Scrum (PO, SM y Developers) comprenden el momento en que se entregará cada capacidad del sistema.</w:t>
       </w:r>
     </w:p>
     <w:p>
@@ -3806,6 +3597,30 @@
           <w:rtl w:val="0"/>
         </w:rPr>
         <w:t xml:space="preserve"> La consecución temprana del MVP en la Fase 2 (9 HUs: HU-01 a HU-08 y HU-14), preparada con la línea base entregada en el Sprint 4 de la Fase 1, mitiga el riesgo académico de llegar al proceso final sin un producto funcional demostrable.</w:t>
+      </w:r>
+    </w:p>
+    <w:p>
+      <w:pPr>
+        <w:numPr>
+          <w:ilvl w:val="0"/>
+          <w:numId w:val="5"/>
+        </w:numPr>
+        <w:pBdr>
+          <w:top w:color="auto" w:space="0" w:sz="0" w:val="none"/>
+          <w:bottom w:color="auto" w:space="0" w:sz="0" w:val="none"/>
+          <w:right w:color="auto" w:space="0" w:sz="0" w:val="none"/>
+          <w:between w:color="auto" w:space="0" w:sz="0" w:val="none"/>
+        </w:pBdr>
+        <w:ind w:left="720" w:hanging="360"/>
+      </w:pPr>
+      <w:r>
+        <w:rPr>
+          <w:b w:val="1"/>
+          <w:bCs w:val="1"/>
+          <w:color w:val="1f1f1f"/>
+          <w:rtl w:val="0"/>
+        </w:rPr>
+        <w:t>Nota de fechas: la entrega del Hito N°1 del Acta (11-09-2026) se realiza dentro del Sprint 4. La Sprint Review y la Retrospectiva del Sprint 4 se registraron el 14-09-2026, que es la fecha de cierre de la Fase 1.</w:t>
       </w:r>
     </w:p>
     <w:p>

</xml_diff>

<commit_message>
Incorporación de Cambios Documentales actuales a mi rama
</commit_message>
<xml_diff>
--- a/Fase 2/Evidencias Proyecto/Evidencias de documentación/1.2 Sprint Planning/1.2.1 Hoja de ruta del proyecto.docx
+++ b/Fase 2/Evidencias Proyecto/Evidencias de documentación/1.2 Sprint Planning/1.2.1 Hoja de ruta del proyecto.docx
@@ -3131,6 +3131,30 @@
     </w:p>
     <w:p>
       <w:pPr>
+        <w:pBdr>
+          <w:top w:color="auto" w:space="0" w:sz="0" w:val="none"/>
+          <w:left w:color="auto" w:space="0" w:sz="0" w:val="none"/>
+          <w:bottom w:color="auto" w:space="0" w:sz="0" w:val="none"/>
+          <w:right w:color="auto" w:space="0" w:sz="0" w:val="none"/>
+          <w:between w:color="auto" w:space="0" w:sz="0" w:val="none"/>
+        </w:pBdr>
+        <w:shd w:fill="ffffff" w:val="clear"/>
+        <w:spacing w:after="100" w:line="259.20000000000005" w:lineRule="auto"/>
+        <w:ind w:left="0" w:firstLine="0"/>
+        <w:rPr>
+          <w:color w:val="1f1f1f"/>
+        </w:rPr>
+      </w:pPr>
+      <w:r>
+        <w:rPr>
+          <w:color w:val="1f1f1f"/>
+          <w:rtl w:val="0"/>
+        </w:rPr>
+        <w:t>Esta Definition of Done es única para el proyecto: se aplica a todas las tarjetas y entregables de la Fase 1 y la Fase 2.</w:t>
+      </w:r>
+    </w:p>
+    <w:p>
+      <w:pPr>
         <w:keepNext w:val="0"/>
         <w:keepLines w:val="0"/>
         <w:pageBreakBefore w:val="0"/>
@@ -3152,15 +3176,14 @@
         <w:jc w:val="left"/>
         <w:rPr>
           <w:color w:val="1f1f1f"/>
-          <w:u w:val="none"/>
-        </w:rPr>
-      </w:pPr>
-      <w:r>
-        <w:rPr>
-          <w:color w:val="1f1f1f"/>
-          <w:rtl w:val="0"/>
-        </w:rPr>
-        <w:t xml:space="preserve">Los criterios de aceptación de los PBI seleccionados están cumplidos y verificados.</w:t>
+        </w:rPr>
+      </w:pPr>
+      <w:r>
+        <w:rPr>
+          <w:color w:val="1f1f1f"/>
+          <w:rtl w:val="0"/>
+        </w:rPr>
+        <w:t xml:space="preserve">El entregable está completo </w:t>
       </w:r>
     </w:p>
     <w:p>
@@ -3186,15 +3209,14 @@
         <w:jc w:val="left"/>
         <w:rPr>
           <w:color w:val="1f1f1f"/>
-          <w:u w:val="none"/>
-        </w:rPr>
-      </w:pPr>
-      <w:r>
-        <w:rPr>
-          <w:color w:val="1f1f1f"/>
-          <w:rtl w:val="0"/>
-        </w:rPr>
-        <w:t xml:space="preserve">El código o documento está versionado y revisado por otro integrante.</w:t>
+        </w:rPr>
+      </w:pPr>
+      <w:r>
+        <w:rPr>
+          <w:color w:val="1f1f1f"/>
+          <w:rtl w:val="0"/>
+        </w:rPr>
+        <w:t xml:space="preserve">Los criterios de aceptación aplicables fueron revisados y cumplidos.</w:t>
       </w:r>
     </w:p>
     <w:p>
@@ -3220,15 +3242,14 @@
         <w:jc w:val="left"/>
         <w:rPr>
           <w:color w:val="1f1f1f"/>
-          <w:u w:val="none"/>
-        </w:rPr>
-      </w:pPr>
-      <w:r>
-        <w:rPr>
-          <w:color w:val="1f1f1f"/>
-          <w:rtl w:val="0"/>
-        </w:rPr>
-        <w:t xml:space="preserve">Las pruebas pertinentes están aprobadas y no existen defectos críticos conocidos.</w:t>
+        </w:rPr>
+      </w:pPr>
+      <w:r>
+        <w:rPr>
+          <w:color w:val="1f1f1f"/>
+          <w:rtl w:val="0"/>
+        </w:rPr>
+        <w:t xml:space="preserve">El documento, diagrama o configuración fue revisado por otro integrante.</w:t>
       </w:r>
     </w:p>
     <w:p>
@@ -3254,15 +3275,14 @@
         <w:jc w:val="left"/>
         <w:rPr>
           <w:color w:val="1f1f1f"/>
-          <w:u w:val="none"/>
-        </w:rPr>
-      </w:pPr>
-      <w:r>
-        <w:rPr>
-          <w:color w:val="1f1f1f"/>
-          <w:rtl w:val="0"/>
-        </w:rPr>
-        <w:t xml:space="preserve">La documentación, trazabilidad, riesgos y evidencias fueron actualizados.</w:t>
+        </w:rPr>
+      </w:pPr>
+      <w:r>
+        <w:rPr>
+          <w:color w:val="1f1f1f"/>
+          <w:rtl w:val="0"/>
+        </w:rPr>
+        <w:t xml:space="preserve">La evidencia se encuentra adjunta o vinculada desde la tarjeta correspondiente.</w:t>
       </w:r>
     </w:p>
     <w:p>
@@ -3288,15 +3308,14 @@
         <w:jc w:val="left"/>
         <w:rPr>
           <w:color w:val="1f1f1f"/>
-          <w:u w:val="none"/>
-        </w:rPr>
-      </w:pPr>
-      <w:r>
-        <w:rPr>
-          <w:color w:val="1f1f1f"/>
-          <w:rtl w:val="0"/>
-        </w:rPr>
-        <w:t xml:space="preserve">No se exponen contraseñas, tokens, datos médicos ni ubicaciones sin autorización.</w:t>
+        </w:rPr>
+      </w:pPr>
+      <w:r>
+        <w:rPr>
+          <w:color w:val="1f1f1f"/>
+          <w:rtl w:val="0"/>
+        </w:rPr>
+        <w:t xml:space="preserve">No existen errores críticos pendientes que impidan presentar el resultado.</w:t>
       </w:r>
     </w:p>
     <w:p>
@@ -3322,44 +3341,14 @@
         <w:jc w:val="left"/>
         <w:rPr>
           <w:color w:val="1f1f1f"/>
-          <w:u w:val="none"/>
-        </w:rPr>
-      </w:pPr>
-      <w:r>
-        <w:rPr>
-          <w:color w:val="1f1f1f"/>
-          <w:rtl w:val="0"/>
-        </w:rPr>
-        <w:t xml:space="preserve">El incremento puede presentarse en la Sprint Review y ser inspeccionado por el Product Owner.</w:t>
-      </w:r>
-      <w:r>
-        <w:rPr>
-          <w:rtl w:val="0"/>
-        </w:rPr>
-      </w:r>
-    </w:p>
-    <w:p>
-      <w:pPr>
-        <w:pBdr>
-          <w:top w:color="auto" w:space="0" w:sz="0" w:val="none"/>
-          <w:left w:color="auto" w:space="0" w:sz="0" w:val="none"/>
-          <w:bottom w:color="auto" w:space="0" w:sz="0" w:val="none"/>
-          <w:right w:color="auto" w:space="0" w:sz="0" w:val="none"/>
-          <w:between w:color="auto" w:space="0" w:sz="0" w:val="none"/>
-        </w:pBdr>
-        <w:shd w:fill="ffffff" w:val="clear"/>
-        <w:spacing w:after="100" w:line="259.20000000000005" w:lineRule="auto"/>
-        <w:ind w:left="0" w:firstLine="0"/>
-        <w:rPr>
-          <w:color w:val="1f1f1f"/>
-        </w:rPr>
-      </w:pPr>
-      <w:r>
-        <w:rPr>
-          <w:color w:val="1f1f1f"/>
-          <w:rtl w:val="0"/>
-        </w:rPr>
-        <w:t xml:space="preserve">La siguiente definición se aplica a todas las tarjetas y entregables de los cuatro Sprints.</w:t>
+        </w:rPr>
+      </w:pPr>
+      <w:r>
+        <w:rPr>
+          <w:color w:val="1f1f1f"/>
+          <w:rtl w:val="0"/>
+        </w:rPr>
+        <w:t xml:space="preserve">La documentación y la trazabilidad relacionadas fueron actualizadas.</w:t>
       </w:r>
     </w:p>
     <w:p>
@@ -3392,7 +3381,7 @@
           <w:color w:val="1f1f1f"/>
           <w:rtl w:val="0"/>
         </w:rPr>
-        <w:t xml:space="preserve">El entregable está completo </w:t>
+        <w:t xml:space="preserve">El resultado puede demostrarse en la Sprint Review y ser inspeccionado por el Product Owner.</w:t>
       </w:r>
     </w:p>
     <w:p>
@@ -3425,204 +3414,6 @@
           <w:color w:val="1f1f1f"/>
           <w:rtl w:val="0"/>
         </w:rPr>
-        <w:t xml:space="preserve">Los criterios de aceptación aplicables fueron revisados y cumplidos.</w:t>
-      </w:r>
-    </w:p>
-    <w:p>
-      <w:pPr>
-        <w:keepNext w:val="0"/>
-        <w:keepLines w:val="0"/>
-        <w:pageBreakBefore w:val="0"/>
-        <w:widowControl w:val="1"/>
-        <w:numPr>
-          <w:ilvl w:val="0"/>
-          <w:numId w:val="1"/>
-        </w:numPr>
-        <w:pBdr>
-          <w:top w:color="auto" w:space="0" w:sz="0" w:val="none"/>
-          <w:left w:space="0" w:sz="0" w:val="nil"/>
-          <w:bottom w:color="auto" w:space="0" w:sz="0" w:val="none"/>
-          <w:right w:color="auto" w:space="0" w:sz="0" w:val="none"/>
-          <w:between w:color="auto" w:space="0" w:sz="0" w:val="none"/>
-        </w:pBdr>
-        <w:shd w:fill="auto" w:val="clear"/>
-        <w:spacing w:after="0" w:before="0" w:line="276" w:lineRule="auto"/>
-        <w:ind w:left="720" w:right="0" w:hanging="360"/>
-        <w:jc w:val="left"/>
-        <w:rPr>
-          <w:color w:val="1f1f1f"/>
-        </w:rPr>
-      </w:pPr>
-      <w:r>
-        <w:rPr>
-          <w:color w:val="1f1f1f"/>
-          <w:rtl w:val="0"/>
-        </w:rPr>
-        <w:t xml:space="preserve">El documento, diagrama o configuración fue revisado por otro integrante.</w:t>
-      </w:r>
-    </w:p>
-    <w:p>
-      <w:pPr>
-        <w:keepNext w:val="0"/>
-        <w:keepLines w:val="0"/>
-        <w:pageBreakBefore w:val="0"/>
-        <w:widowControl w:val="1"/>
-        <w:numPr>
-          <w:ilvl w:val="0"/>
-          <w:numId w:val="1"/>
-        </w:numPr>
-        <w:pBdr>
-          <w:top w:color="auto" w:space="0" w:sz="0" w:val="none"/>
-          <w:left w:space="0" w:sz="0" w:val="nil"/>
-          <w:bottom w:color="auto" w:space="0" w:sz="0" w:val="none"/>
-          <w:right w:color="auto" w:space="0" w:sz="0" w:val="none"/>
-          <w:between w:color="auto" w:space="0" w:sz="0" w:val="none"/>
-        </w:pBdr>
-        <w:shd w:fill="auto" w:val="clear"/>
-        <w:spacing w:after="0" w:before="0" w:line="276" w:lineRule="auto"/>
-        <w:ind w:left="720" w:right="0" w:hanging="360"/>
-        <w:jc w:val="left"/>
-        <w:rPr>
-          <w:color w:val="1f1f1f"/>
-        </w:rPr>
-      </w:pPr>
-      <w:r>
-        <w:rPr>
-          <w:color w:val="1f1f1f"/>
-          <w:rtl w:val="0"/>
-        </w:rPr>
-        <w:t xml:space="preserve">La evidencia se encuentra adjunta o vinculada desde la tarjeta correspondiente.</w:t>
-      </w:r>
-    </w:p>
-    <w:p>
-      <w:pPr>
-        <w:keepNext w:val="0"/>
-        <w:keepLines w:val="0"/>
-        <w:pageBreakBefore w:val="0"/>
-        <w:widowControl w:val="1"/>
-        <w:numPr>
-          <w:ilvl w:val="0"/>
-          <w:numId w:val="1"/>
-        </w:numPr>
-        <w:pBdr>
-          <w:top w:color="auto" w:space="0" w:sz="0" w:val="none"/>
-          <w:left w:space="0" w:sz="0" w:val="nil"/>
-          <w:bottom w:color="auto" w:space="0" w:sz="0" w:val="none"/>
-          <w:right w:color="auto" w:space="0" w:sz="0" w:val="none"/>
-          <w:between w:color="auto" w:space="0" w:sz="0" w:val="none"/>
-        </w:pBdr>
-        <w:shd w:fill="auto" w:val="clear"/>
-        <w:spacing w:after="0" w:before="0" w:line="276" w:lineRule="auto"/>
-        <w:ind w:left="720" w:right="0" w:hanging="360"/>
-        <w:jc w:val="left"/>
-        <w:rPr>
-          <w:color w:val="1f1f1f"/>
-        </w:rPr>
-      </w:pPr>
-      <w:r>
-        <w:rPr>
-          <w:color w:val="1f1f1f"/>
-          <w:rtl w:val="0"/>
-        </w:rPr>
-        <w:t xml:space="preserve">No existen errores críticos pendientes que impidan presentar el resultado.</w:t>
-      </w:r>
-    </w:p>
-    <w:p>
-      <w:pPr>
-        <w:keepNext w:val="0"/>
-        <w:keepLines w:val="0"/>
-        <w:pageBreakBefore w:val="0"/>
-        <w:widowControl w:val="1"/>
-        <w:numPr>
-          <w:ilvl w:val="0"/>
-          <w:numId w:val="1"/>
-        </w:numPr>
-        <w:pBdr>
-          <w:top w:color="auto" w:space="0" w:sz="0" w:val="none"/>
-          <w:left w:space="0" w:sz="0" w:val="nil"/>
-          <w:bottom w:color="auto" w:space="0" w:sz="0" w:val="none"/>
-          <w:right w:color="auto" w:space="0" w:sz="0" w:val="none"/>
-          <w:between w:color="auto" w:space="0" w:sz="0" w:val="none"/>
-        </w:pBdr>
-        <w:shd w:fill="auto" w:val="clear"/>
-        <w:spacing w:after="0" w:before="0" w:line="276" w:lineRule="auto"/>
-        <w:ind w:left="720" w:right="0" w:hanging="360"/>
-        <w:jc w:val="left"/>
-        <w:rPr>
-          <w:color w:val="1f1f1f"/>
-        </w:rPr>
-      </w:pPr>
-      <w:r>
-        <w:rPr>
-          <w:color w:val="1f1f1f"/>
-          <w:rtl w:val="0"/>
-        </w:rPr>
-        <w:t xml:space="preserve">La documentación y la trazabilidad relacionadas fueron actualizadas.</w:t>
-      </w:r>
-    </w:p>
-    <w:p>
-      <w:pPr>
-        <w:keepNext w:val="0"/>
-        <w:keepLines w:val="0"/>
-        <w:pageBreakBefore w:val="0"/>
-        <w:widowControl w:val="1"/>
-        <w:numPr>
-          <w:ilvl w:val="0"/>
-          <w:numId w:val="1"/>
-        </w:numPr>
-        <w:pBdr>
-          <w:top w:color="auto" w:space="0" w:sz="0" w:val="none"/>
-          <w:left w:space="0" w:sz="0" w:val="nil"/>
-          <w:bottom w:color="auto" w:space="0" w:sz="0" w:val="none"/>
-          <w:right w:color="auto" w:space="0" w:sz="0" w:val="none"/>
-          <w:between w:color="auto" w:space="0" w:sz="0" w:val="none"/>
-        </w:pBdr>
-        <w:shd w:fill="auto" w:val="clear"/>
-        <w:spacing w:after="0" w:before="0" w:line="276" w:lineRule="auto"/>
-        <w:ind w:left="720" w:right="0" w:hanging="360"/>
-        <w:jc w:val="left"/>
-        <w:rPr>
-          <w:color w:val="1f1f1f"/>
-        </w:rPr>
-      </w:pPr>
-      <w:r>
-        <w:rPr>
-          <w:color w:val="1f1f1f"/>
-          <w:rtl w:val="0"/>
-        </w:rPr>
-        <w:t xml:space="preserve">El resultado puede demostrarse en la Sprint Review y ser inspeccionado por el Product Owner.</w:t>
-      </w:r>
-    </w:p>
-    <w:p>
-      <w:pPr>
-        <w:keepNext w:val="0"/>
-        <w:keepLines w:val="0"/>
-        <w:pageBreakBefore w:val="0"/>
-        <w:widowControl w:val="1"/>
-        <w:numPr>
-          <w:ilvl w:val="0"/>
-          <w:numId w:val="1"/>
-        </w:numPr>
-        <w:pBdr>
-          <w:top w:color="auto" w:space="0" w:sz="0" w:val="none"/>
-          <w:left w:space="0" w:sz="0" w:val="nil"/>
-          <w:bottom w:color="auto" w:space="0" w:sz="0" w:val="none"/>
-          <w:right w:color="auto" w:space="0" w:sz="0" w:val="none"/>
-          <w:between w:color="auto" w:space="0" w:sz="0" w:val="none"/>
-        </w:pBdr>
-        <w:shd w:fill="auto" w:val="clear"/>
-        <w:spacing w:after="0" w:before="0" w:line="276" w:lineRule="auto"/>
-        <w:ind w:left="720" w:right="0" w:hanging="360"/>
-        <w:jc w:val="left"/>
-        <w:rPr>
-          <w:color w:val="1f1f1f"/>
-        </w:rPr>
-      </w:pPr>
-      <w:r>
-        <w:rPr>
-          <w:color w:val="1f1f1f"/>
-          <w:rtl w:val="0"/>
-        </w:rPr>
         <w:t xml:space="preserve">La tarjeta queda marcada como completada solamente después de la validación correspondiente.</w:t>
       </w:r>
       <w:r>
@@ -3774,7 +3565,7 @@
           <w:color w:val="1f1f1f"/>
           <w:rtl w:val="0"/>
         </w:rPr>
-        <w:t xml:space="preserve"> Establece un horizonte claro de 7 semanas de trabajo donde los roles Scrum (PO, SM y Developers) comprenden el momento en que se entregará cada capacidad del sistema.</w:t>
+        <w:t xml:space="preserve"> Establece un horizonte claro de 5 semanas de trabajo donde los roles Scrum (PO, SM y Developers) comprenden el momento en que se entregará cada capacidad del sistema.</w:t>
       </w:r>
     </w:p>
     <w:p>
@@ -3806,6 +3597,30 @@
           <w:rtl w:val="0"/>
         </w:rPr>
         <w:t xml:space="preserve"> La consecución temprana del MVP en la Fase 2 (9 HUs: HU-01 a HU-08 y HU-14), preparada con la línea base entregada en el Sprint 4 de la Fase 1, mitiga el riesgo académico de llegar al proceso final sin un producto funcional demostrable.</w:t>
+      </w:r>
+    </w:p>
+    <w:p>
+      <w:pPr>
+        <w:numPr>
+          <w:ilvl w:val="0"/>
+          <w:numId w:val="5"/>
+        </w:numPr>
+        <w:pBdr>
+          <w:top w:color="auto" w:space="0" w:sz="0" w:val="none"/>
+          <w:bottom w:color="auto" w:space="0" w:sz="0" w:val="none"/>
+          <w:right w:color="auto" w:space="0" w:sz="0" w:val="none"/>
+          <w:between w:color="auto" w:space="0" w:sz="0" w:val="none"/>
+        </w:pBdr>
+        <w:ind w:left="720" w:hanging="360"/>
+      </w:pPr>
+      <w:r>
+        <w:rPr>
+          <w:b w:val="1"/>
+          <w:bCs w:val="1"/>
+          <w:color w:val="1f1f1f"/>
+          <w:rtl w:val="0"/>
+        </w:rPr>
+        <w:t>Nota de fechas: la entrega del Hito N°1 del Acta (11-09-2026) se realiza dentro del Sprint 4. La Sprint Review y la Retrospectiva del Sprint 4 se registraron el 14-09-2026, que es la fecha de cierre de la Fase 1.</w:t>
       </w:r>
     </w:p>
     <w:p>

</xml_diff>

<commit_message>
Actualización de readme y actualización de documentos (NO CORRESPONDIENTES A RAMA "/main")
</commit_message>
<xml_diff>
--- a/Fase 2/Evidencias Proyecto/Evidencias de documentación/1.2 Sprint Planning/1.2.1 Hoja de ruta del proyecto.docx
+++ b/Fase 2/Evidencias Proyecto/Evidencias de documentación/1.2 Sprint Planning/1.2.1 Hoja de ruta del proyecto.docx
@@ -8,11 +8,11 @@
         <w:keepNext w:val="0"/>
         <w:keepLines w:val="0"/>
         <w:pBdr>
-          <w:top w:color="auto" w:space="0" w:sz="0" w:val="none"/>
-          <w:left w:color="auto" w:space="0" w:sz="0" w:val="none"/>
-          <w:bottom w:color="auto" w:space="0" w:sz="0" w:val="none"/>
-          <w:right w:color="auto" w:space="0" w:sz="0" w:val="none"/>
-          <w:between w:color="auto" w:space="0" w:sz="0" w:val="none"/>
+          <w:top w:color="000000" w:space="0" w:sz="0" w:val="none"/>
+          <w:left w:color="000000" w:space="0" w:sz="0" w:val="none"/>
+          <w:bottom w:color="000000" w:space="0" w:sz="0" w:val="none"/>
+          <w:right w:color="000000" w:space="0" w:sz="0" w:val="none"/>
+          <w:between w:color="000000" w:space="0" w:sz="0" w:val="none"/>
         </w:pBdr>
         <w:spacing w:after="0" w:before="0" w:lineRule="auto"/>
         <w:rPr>
@@ -21,7 +21,7 @@
           <w:color w:val="1f1f1f"/>
         </w:rPr>
       </w:pPr>
-      <w:bookmarkStart w:colFirst="0" w:colLast="0" w:name="_66fc48xz356z" w:id="0"/>
+      <w:bookmarkStart w:colFirst="0" w:colLast="0" w:name="_heading=h.muqsx27stmuq" w:id="0"/>
       <w:bookmarkEnd w:id="0"/>
       <w:r>
         <w:rPr>
@@ -58,11 +58,11 @@
         <w:keepNext w:val="0"/>
         <w:keepLines w:val="0"/>
         <w:pBdr>
-          <w:top w:color="auto" w:space="0" w:sz="0" w:val="none"/>
-          <w:left w:color="auto" w:space="0" w:sz="0" w:val="none"/>
-          <w:bottom w:color="auto" w:space="0" w:sz="0" w:val="none"/>
-          <w:right w:color="auto" w:space="0" w:sz="0" w:val="none"/>
-          <w:between w:color="auto" w:space="0" w:sz="0" w:val="none"/>
+          <w:top w:color="000000" w:space="0" w:sz="0" w:val="none"/>
+          <w:left w:color="000000" w:space="0" w:sz="0" w:val="none"/>
+          <w:bottom w:color="000000" w:space="0" w:sz="0" w:val="none"/>
+          <w:right w:color="000000" w:space="0" w:sz="0" w:val="none"/>
+          <w:between w:color="000000" w:space="0" w:sz="0" w:val="none"/>
         </w:pBdr>
         <w:spacing w:after="0" w:before="0" w:lineRule="auto"/>
         <w:rPr>
@@ -73,7 +73,7 @@
           <w:szCs w:val="34"/>
         </w:rPr>
       </w:pPr>
-      <w:bookmarkStart w:colFirst="0" w:colLast="0" w:name="_6imycvsncmve" w:id="1"/>
+      <w:bookmarkStart w:colFirst="0" w:colLast="0" w:name="_heading=h.oe56li1od5zz" w:id="1"/>
       <w:bookmarkEnd w:id="1"/>
       <w:r>
         <w:rPr>
@@ -114,7 +114,7 @@
           <w:color w:val="1f1f1f"/>
           <w:rtl w:val="0"/>
         </w:rPr>
-        <w:t xml:space="preserve"> oficial para el proyecto enfocado en el desarrollo de una plataforma multiplataforma de gestión y comunicación de emergencias. En el marco de la metodología Scrum, la planificación de Sprints es la </w:t>
+        <w:t xml:space="preserve"> oficial para el proyecto, en el marco de la metodología Scrum, la planificación de Sprints es la </w:t>
       </w:r>
       <w:r>
         <w:rPr>
@@ -132,11 +132,6 @@
         </w:rPr>
         <w:t xml:space="preserve">.</w:t>
       </w:r>
-      <w:r>
-        <w:rPr>
-          <w:rtl w:val="0"/>
-        </w:rPr>
-      </w:r>
     </w:p>
     <w:p>
       <w:pPr>
@@ -155,10 +150,10 @@
     <w:p>
       <w:pPr>
         <w:pBdr>
-          <w:top w:color="auto" w:space="0" w:sz="0" w:val="none"/>
-          <w:bottom w:color="auto" w:space="0" w:sz="0" w:val="none"/>
-          <w:right w:color="auto" w:space="0" w:sz="0" w:val="none"/>
-          <w:between w:color="auto" w:space="0" w:sz="0" w:val="none"/>
+          <w:top w:color="000000" w:space="0" w:sz="0" w:val="none"/>
+          <w:bottom w:color="000000" w:space="0" w:sz="0" w:val="none"/>
+          <w:right w:color="000000" w:space="0" w:sz="0" w:val="none"/>
+          <w:between w:color="000000" w:space="0" w:sz="0" w:val="none"/>
         </w:pBdr>
         <w:ind w:left="0" w:firstLine="0"/>
         <w:rPr>
@@ -195,11 +190,11 @@
         <w:keepNext w:val="0"/>
         <w:keepLines w:val="0"/>
         <w:pBdr>
-          <w:top w:color="auto" w:space="0" w:sz="0" w:val="none"/>
-          <w:left w:color="auto" w:space="0" w:sz="0" w:val="none"/>
-          <w:bottom w:color="auto" w:space="0" w:sz="0" w:val="none"/>
-          <w:right w:color="auto" w:space="0" w:sz="0" w:val="none"/>
-          <w:between w:color="auto" w:space="0" w:sz="0" w:val="none"/>
+          <w:top w:color="000000" w:space="0" w:sz="0" w:val="none"/>
+          <w:left w:color="000000" w:space="0" w:sz="0" w:val="none"/>
+          <w:bottom w:color="000000" w:space="0" w:sz="0" w:val="none"/>
+          <w:right w:color="000000" w:space="0" w:sz="0" w:val="none"/>
+          <w:between w:color="000000" w:space="0" w:sz="0" w:val="none"/>
         </w:pBdr>
         <w:spacing w:after="0" w:before="0" w:lineRule="auto"/>
         <w:rPr>
@@ -210,7 +205,7 @@
           <w:szCs w:val="34"/>
         </w:rPr>
       </w:pPr>
-      <w:bookmarkStart w:colFirst="0" w:colLast="0" w:name="_kpccbo170r0o" w:id="2"/>
+      <w:bookmarkStart w:colFirst="0" w:colLast="0" w:name="_heading=h.4vnjmyu1aqt4" w:id="2"/>
       <w:bookmarkEnd w:id="2"/>
       <w:r>
         <w:rPr>
@@ -230,11 +225,11 @@
         <w:keepNext w:val="0"/>
         <w:keepLines w:val="0"/>
         <w:pBdr>
-          <w:top w:color="auto" w:space="0" w:sz="0" w:val="none"/>
-          <w:left w:color="auto" w:space="0" w:sz="0" w:val="none"/>
-          <w:bottom w:color="auto" w:space="0" w:sz="0" w:val="none"/>
-          <w:right w:color="auto" w:space="0" w:sz="0" w:val="none"/>
-          <w:between w:color="auto" w:space="0" w:sz="0" w:val="none"/>
+          <w:top w:color="000000" w:space="0" w:sz="0" w:val="none"/>
+          <w:left w:color="000000" w:space="0" w:sz="0" w:val="none"/>
+          <w:bottom w:color="000000" w:space="0" w:sz="0" w:val="none"/>
+          <w:right w:color="000000" w:space="0" w:sz="0" w:val="none"/>
+          <w:between w:color="000000" w:space="0" w:sz="0" w:val="none"/>
         </w:pBdr>
         <w:spacing w:after="0" w:before="0" w:lineRule="auto"/>
         <w:rPr>
@@ -245,7 +240,7 @@
           <w:szCs w:val="26"/>
         </w:rPr>
       </w:pPr>
-      <w:bookmarkStart w:colFirst="0" w:colLast="0" w:name="_hyeleej9paw7" w:id="3"/>
+      <w:bookmarkStart w:colFirst="0" w:colLast="0" w:name="_heading=h.7aaot1z4tycu" w:id="3"/>
       <w:bookmarkEnd w:id="3"/>
       <w:r>
         <w:rPr>
@@ -291,11 +286,11 @@
         <w:keepNext w:val="0"/>
         <w:keepLines w:val="0"/>
         <w:pBdr>
-          <w:top w:color="auto" w:space="0" w:sz="0" w:val="none"/>
-          <w:left w:color="auto" w:space="0" w:sz="0" w:val="none"/>
-          <w:bottom w:color="auto" w:space="0" w:sz="0" w:val="none"/>
-          <w:right w:color="auto" w:space="0" w:sz="0" w:val="none"/>
-          <w:between w:color="auto" w:space="0" w:sz="0" w:val="none"/>
+          <w:top w:color="000000" w:space="0" w:sz="0" w:val="none"/>
+          <w:left w:color="000000" w:space="0" w:sz="0" w:val="none"/>
+          <w:bottom w:color="000000" w:space="0" w:sz="0" w:val="none"/>
+          <w:right w:color="000000" w:space="0" w:sz="0" w:val="none"/>
+          <w:between w:color="000000" w:space="0" w:sz="0" w:val="none"/>
         </w:pBdr>
         <w:spacing w:after="0" w:before="0" w:lineRule="auto"/>
         <w:rPr>
@@ -306,7 +301,7 @@
           <w:szCs w:val="26"/>
         </w:rPr>
       </w:pPr>
-      <w:bookmarkStart w:colFirst="0" w:colLast="0" w:name="_kpuakueh8bur" w:id="4"/>
+      <w:bookmarkStart w:colFirst="0" w:colLast="0" w:name="_heading=h.x6rghcuk2mni" w:id="4"/>
       <w:bookmarkEnd w:id="4"/>
       <w:r>
         <w:rPr>
@@ -327,12 +322,13 @@
           <w:numId w:val="7"/>
         </w:numPr>
         <w:pBdr>
-          <w:top w:color="auto" w:space="0" w:sz="0" w:val="none"/>
-          <w:bottom w:color="auto" w:space="0" w:sz="0" w:val="none"/>
-          <w:right w:color="auto" w:space="0" w:sz="0" w:val="none"/>
-          <w:between w:color="auto" w:space="0" w:sz="0" w:val="none"/>
+          <w:top w:color="000000" w:space="0" w:sz="0" w:val="none"/>
+          <w:bottom w:color="000000" w:space="0" w:sz="0" w:val="none"/>
+          <w:right w:color="000000" w:space="0" w:sz="0" w:val="none"/>
+          <w:between w:color="000000" w:space="0" w:sz="0" w:val="none"/>
         </w:pBdr>
         <w:ind w:left="720" w:hanging="360"/>
+        <w:rPr/>
       </w:pPr>
       <w:r>
         <w:rPr>
@@ -340,6 +336,11 @@
           <w:rtl w:val="0"/>
         </w:rPr>
         <w:t xml:space="preserve">Establecer una secuencia de desarrollo coherente basada en dependencias técnicas y funcionales.</w:t>
+      </w:r>
+      <w:r>
+        <w:rPr>
+          <w:rtl w:val="0"/>
+        </w:rPr>
       </w:r>
     </w:p>
     <w:p>
@@ -349,19 +350,25 @@
           <w:numId w:val="7"/>
         </w:numPr>
         <w:pBdr>
-          <w:top w:color="auto" w:space="0" w:sz="0" w:val="none"/>
-          <w:bottom w:color="auto" w:space="0" w:sz="0" w:val="none"/>
-          <w:right w:color="auto" w:space="0" w:sz="0" w:val="none"/>
-          <w:between w:color="auto" w:space="0" w:sz="0" w:val="none"/>
+          <w:top w:color="000000" w:space="0" w:sz="0" w:val="none"/>
+          <w:bottom w:color="000000" w:space="0" w:sz="0" w:val="none"/>
+          <w:right w:color="000000" w:space="0" w:sz="0" w:val="none"/>
+          <w:between w:color="000000" w:space="0" w:sz="0" w:val="none"/>
         </w:pBdr>
         <w:ind w:left="720" w:hanging="360"/>
-      </w:pPr>
-      <w:r>
-        <w:rPr>
-          <w:color w:val="1f1f1f"/>
-          <w:rtl w:val="0"/>
-        </w:rPr>
-        <w:t xml:space="preserve">Garantizar el enfoque prioritario en las 9 Historias de Usuario pertenecientes al MVP.</w:t>
+        <w:rPr/>
+      </w:pPr>
+      <w:r>
+        <w:rPr>
+          <w:color w:val="1f1f1f"/>
+          <w:rtl w:val="0"/>
+        </w:rPr>
+        <w:t xml:space="preserve">Garantizar el enfoque prioritario en las 19 Historias de Usuario pertenecientes al MVP.</w:t>
+      </w:r>
+      <w:r>
+        <w:rPr>
+          <w:rtl w:val="0"/>
+        </w:rPr>
       </w:r>
     </w:p>
     <w:p>
@@ -371,12 +378,13 @@
           <w:numId w:val="7"/>
         </w:numPr>
         <w:pBdr>
-          <w:top w:color="auto" w:space="0" w:sz="0" w:val="none"/>
-          <w:bottom w:color="auto" w:space="0" w:sz="0" w:val="none"/>
-          <w:right w:color="auto" w:space="0" w:sz="0" w:val="none"/>
-          <w:between w:color="auto" w:space="0" w:sz="0" w:val="none"/>
+          <w:top w:color="000000" w:space="0" w:sz="0" w:val="none"/>
+          <w:bottom w:color="000000" w:space="0" w:sz="0" w:val="none"/>
+          <w:right w:color="000000" w:space="0" w:sz="0" w:val="none"/>
+          <w:between w:color="000000" w:space="0" w:sz="0" w:val="none"/>
         </w:pBdr>
         <w:ind w:left="720" w:hanging="360"/>
+        <w:rPr/>
       </w:pPr>
       <w:r>
         <w:rPr>
@@ -384,6 +392,11 @@
           <w:rtl w:val="0"/>
         </w:rPr>
         <w:t xml:space="preserve">Mapear hitos de control académico y técnico utilizables en la Carta Gantt del proyecto de título.</w:t>
+      </w:r>
+      <w:r>
+        <w:rPr>
+          <w:rtl w:val="0"/>
+        </w:rPr>
       </w:r>
     </w:p>
     <w:p>
@@ -393,12 +406,13 @@
           <w:numId w:val="7"/>
         </w:numPr>
         <w:pBdr>
-          <w:top w:color="auto" w:space="0" w:sz="0" w:val="none"/>
-          <w:bottom w:color="auto" w:space="0" w:sz="0" w:val="none"/>
-          <w:right w:color="auto" w:space="0" w:sz="0" w:val="none"/>
-          <w:between w:color="auto" w:space="0" w:sz="0" w:val="none"/>
+          <w:top w:color="000000" w:space="0" w:sz="0" w:val="none"/>
+          <w:bottom w:color="000000" w:space="0" w:sz="0" w:val="none"/>
+          <w:right w:color="000000" w:space="0" w:sz="0" w:val="none"/>
+          <w:between w:color="000000" w:space="0" w:sz="0" w:val="none"/>
         </w:pBdr>
         <w:ind w:left="720" w:hanging="360"/>
+        <w:rPr/>
       </w:pPr>
       <w:r>
         <w:rPr>
@@ -423,32 +437,37 @@
         </w:rPr>
         <w:t xml:space="preserve"> semanal sin prescribir prematuramente las tareas técnicas operativas.</w:t>
       </w:r>
-    </w:p>
-    <w:p>
-      <w:pPr>
-        <w:pBdr>
-          <w:top w:color="auto" w:space="0" w:sz="0" w:val="none"/>
-          <w:bottom w:color="auto" w:space="0" w:sz="0" w:val="none"/>
-          <w:right w:color="auto" w:space="0" w:sz="0" w:val="none"/>
-          <w:between w:color="auto" w:space="0" w:sz="0" w:val="none"/>
-        </w:pBdr>
-        <w:rPr>
-          <w:color w:val="1f1f1f"/>
-        </w:rPr>
-      </w:pPr>
-      <w:r>
-        <w:rPr>
-          <w:rtl w:val="0"/>
-        </w:rPr>
-      </w:r>
-    </w:p>
-    <w:p>
-      <w:pPr>
-        <w:pBdr>
-          <w:top w:color="auto" w:space="0" w:sz="0" w:val="none"/>
-          <w:bottom w:color="auto" w:space="0" w:sz="0" w:val="none"/>
-          <w:right w:color="auto" w:space="0" w:sz="0" w:val="none"/>
-          <w:between w:color="auto" w:space="0" w:sz="0" w:val="none"/>
+      <w:r>
+        <w:rPr>
+          <w:rtl w:val="0"/>
+        </w:rPr>
+      </w:r>
+    </w:p>
+    <w:p>
+      <w:pPr>
+        <w:pBdr>
+          <w:top w:color="000000" w:space="0" w:sz="0" w:val="none"/>
+          <w:bottom w:color="000000" w:space="0" w:sz="0" w:val="none"/>
+          <w:right w:color="000000" w:space="0" w:sz="0" w:val="none"/>
+          <w:between w:color="000000" w:space="0" w:sz="0" w:val="none"/>
+        </w:pBdr>
+        <w:rPr>
+          <w:color w:val="1f1f1f"/>
+        </w:rPr>
+      </w:pPr>
+      <w:r>
+        <w:rPr>
+          <w:rtl w:val="0"/>
+        </w:rPr>
+      </w:r>
+    </w:p>
+    <w:p>
+      <w:pPr>
+        <w:pBdr>
+          <w:top w:color="000000" w:space="0" w:sz="0" w:val="none"/>
+          <w:bottom w:color="000000" w:space="0" w:sz="0" w:val="none"/>
+          <w:right w:color="000000" w:space="0" w:sz="0" w:val="none"/>
+          <w:between w:color="000000" w:space="0" w:sz="0" w:val="none"/>
         </w:pBdr>
         <w:rPr>
           <w:color w:val="1f1f1f"/>
@@ -466,11 +485,11 @@
         <w:keepNext w:val="0"/>
         <w:keepLines w:val="0"/>
         <w:pBdr>
-          <w:top w:color="auto" w:space="0" w:sz="0" w:val="none"/>
-          <w:left w:color="auto" w:space="0" w:sz="0" w:val="none"/>
-          <w:bottom w:color="auto" w:space="0" w:sz="0" w:val="none"/>
-          <w:right w:color="auto" w:space="0" w:sz="0" w:val="none"/>
-          <w:between w:color="auto" w:space="0" w:sz="0" w:val="none"/>
+          <w:top w:color="000000" w:space="0" w:sz="0" w:val="none"/>
+          <w:left w:color="000000" w:space="0" w:sz="0" w:val="none"/>
+          <w:bottom w:color="000000" w:space="0" w:sz="0" w:val="none"/>
+          <w:right w:color="000000" w:space="0" w:sz="0" w:val="none"/>
+          <w:between w:color="000000" w:space="0" w:sz="0" w:val="none"/>
         </w:pBdr>
         <w:spacing w:after="0" w:before="0" w:lineRule="auto"/>
         <w:rPr>
@@ -481,7 +500,7 @@
           <w:szCs w:val="34"/>
         </w:rPr>
       </w:pPr>
-      <w:bookmarkStart w:colFirst="0" w:colLast="0" w:name="_iwtzb07rzyki" w:id="5"/>
+      <w:bookmarkStart w:colFirst="0" w:colLast="0" w:name="_heading=h.s9jd70bphvy8" w:id="5"/>
       <w:bookmarkEnd w:id="5"/>
       <w:r>
         <w:rPr>
@@ -524,22 +543,22 @@
     <w:tbl>
       <w:tblPr>
         <w:tblStyle w:val="Table1"/>
-        <w:tblW w:w="9025.511811023624" w:type="dxa"/>
+        <w:tblW w:w="9030.0" w:type="dxa"/>
         <w:jc w:val="left"/>
         <w:tblLayout w:type="fixed"/>
         <w:tblLook w:val="0600"/>
       </w:tblPr>
       <w:tblGrid>
-        <w:gridCol w:w="1825.3844112182608"/>
-        <w:gridCol w:w="2028.2049013536232"/>
-        <w:gridCol w:w="2028.2049013536232"/>
-        <w:gridCol w:w="3143.717597098116"/>
+        <w:gridCol w:w="1680"/>
+        <w:gridCol w:w="2145"/>
+        <w:gridCol w:w="1695"/>
+        <w:gridCol w:w="3510"/>
         <w:tblGridChange w:id="0">
           <w:tblGrid>
-            <w:gridCol w:w="1825.3844112182608"/>
-            <w:gridCol w:w="2028.2049013536232"/>
-            <w:gridCol w:w="2028.2049013536232"/>
-            <w:gridCol w:w="3143.717597098116"/>
+            <w:gridCol w:w="1680"/>
+            <w:gridCol w:w="2145"/>
+            <w:gridCol w:w="1695"/>
+            <w:gridCol w:w="3510"/>
           </w:tblGrid>
         </w:tblGridChange>
       </w:tblGrid>
@@ -571,11 +590,11 @@
               <w:keepLines w:val="0"/>
               <w:widowControl w:val="0"/>
               <w:pBdr>
-                <w:top w:color="auto" w:space="0" w:sz="0" w:val="none"/>
-                <w:left w:color="auto" w:space="0" w:sz="0" w:val="none"/>
-                <w:bottom w:color="auto" w:space="0" w:sz="0" w:val="none"/>
-                <w:right w:color="auto" w:space="0" w:sz="0" w:val="none"/>
-                <w:between w:color="auto" w:space="0" w:sz="0" w:val="none"/>
+                <w:top w:color="000000" w:space="0" w:sz="0" w:val="none"/>
+                <w:left w:color="000000" w:space="0" w:sz="0" w:val="none"/>
+                <w:bottom w:color="000000" w:space="0" w:sz="0" w:val="none"/>
+                <w:right w:color="000000" w:space="0" w:sz="0" w:val="none"/>
+                <w:between w:color="000000" w:space="0" w:sz="0" w:val="none"/>
               </w:pBdr>
               <w:spacing w:line="240" w:lineRule="auto"/>
               <w:jc w:val="center"/>
@@ -616,11 +635,11 @@
               <w:keepLines w:val="0"/>
               <w:widowControl w:val="0"/>
               <w:pBdr>
-                <w:top w:color="auto" w:space="0" w:sz="0" w:val="none"/>
-                <w:left w:color="auto" w:space="0" w:sz="0" w:val="none"/>
-                <w:bottom w:color="auto" w:space="0" w:sz="0" w:val="none"/>
-                <w:right w:color="auto" w:space="0" w:sz="0" w:val="none"/>
-                <w:between w:color="auto" w:space="0" w:sz="0" w:val="none"/>
+                <w:top w:color="000000" w:space="0" w:sz="0" w:val="none"/>
+                <w:left w:color="000000" w:space="0" w:sz="0" w:val="none"/>
+                <w:bottom w:color="000000" w:space="0" w:sz="0" w:val="none"/>
+                <w:right w:color="000000" w:space="0" w:sz="0" w:val="none"/>
+                <w:between w:color="000000" w:space="0" w:sz="0" w:val="none"/>
               </w:pBdr>
               <w:spacing w:line="240" w:lineRule="auto"/>
               <w:jc w:val="center"/>
@@ -661,11 +680,11 @@
               <w:keepLines w:val="0"/>
               <w:widowControl w:val="0"/>
               <w:pBdr>
-                <w:top w:color="auto" w:space="0" w:sz="0" w:val="none"/>
-                <w:left w:color="auto" w:space="0" w:sz="0" w:val="none"/>
-                <w:bottom w:color="auto" w:space="0" w:sz="0" w:val="none"/>
-                <w:right w:color="auto" w:space="0" w:sz="0" w:val="none"/>
-                <w:between w:color="auto" w:space="0" w:sz="0" w:val="none"/>
+                <w:top w:color="000000" w:space="0" w:sz="0" w:val="none"/>
+                <w:left w:color="000000" w:space="0" w:sz="0" w:val="none"/>
+                <w:bottom w:color="000000" w:space="0" w:sz="0" w:val="none"/>
+                <w:right w:color="000000" w:space="0" w:sz="0" w:val="none"/>
+                <w:between w:color="000000" w:space="0" w:sz="0" w:val="none"/>
               </w:pBdr>
               <w:spacing w:line="240" w:lineRule="auto"/>
               <w:jc w:val="center"/>
@@ -706,11 +725,11 @@
               <w:keepLines w:val="0"/>
               <w:widowControl w:val="0"/>
               <w:pBdr>
-                <w:top w:color="auto" w:space="0" w:sz="0" w:val="none"/>
-                <w:left w:color="auto" w:space="0" w:sz="0" w:val="none"/>
-                <w:bottom w:color="auto" w:space="0" w:sz="0" w:val="none"/>
-                <w:right w:color="auto" w:space="0" w:sz="0" w:val="none"/>
-                <w:between w:color="auto" w:space="0" w:sz="0" w:val="none"/>
+                <w:top w:color="000000" w:space="0" w:sz="0" w:val="none"/>
+                <w:left w:color="000000" w:space="0" w:sz="0" w:val="none"/>
+                <w:bottom w:color="000000" w:space="0" w:sz="0" w:val="none"/>
+                <w:right w:color="000000" w:space="0" w:sz="0" w:val="none"/>
+                <w:between w:color="000000" w:space="0" w:sz="0" w:val="none"/>
               </w:pBdr>
               <w:spacing w:line="240" w:lineRule="auto"/>
               <w:jc w:val="center"/>
@@ -757,11 +776,11 @@
               <w:keepLines w:val="0"/>
               <w:widowControl w:val="0"/>
               <w:pBdr>
-                <w:top w:color="auto" w:space="0" w:sz="0" w:val="none"/>
-                <w:left w:color="auto" w:space="0" w:sz="0" w:val="none"/>
-                <w:bottom w:color="auto" w:space="0" w:sz="0" w:val="none"/>
-                <w:right w:color="auto" w:space="0" w:sz="0" w:val="none"/>
-                <w:between w:color="auto" w:space="0" w:sz="0" w:val="none"/>
+                <w:top w:color="000000" w:space="0" w:sz="0" w:val="none"/>
+                <w:left w:color="000000" w:space="0" w:sz="0" w:val="none"/>
+                <w:bottom w:color="000000" w:space="0" w:sz="0" w:val="none"/>
+                <w:right w:color="000000" w:space="0" w:sz="0" w:val="none"/>
+                <w:between w:color="000000" w:space="0" w:sz="0" w:val="none"/>
               </w:pBdr>
               <w:spacing w:line="240" w:lineRule="auto"/>
               <w:rPr>
@@ -798,11 +817,11 @@
               <w:keepLines w:val="0"/>
               <w:widowControl w:val="0"/>
               <w:pBdr>
-                <w:top w:color="auto" w:space="0" w:sz="0" w:val="none"/>
-                <w:left w:color="auto" w:space="0" w:sz="0" w:val="none"/>
-                <w:bottom w:color="auto" w:space="0" w:sz="0" w:val="none"/>
-                <w:right w:color="auto" w:space="0" w:sz="0" w:val="none"/>
-                <w:between w:color="auto" w:space="0" w:sz="0" w:val="none"/>
+                <w:top w:color="000000" w:space="0" w:sz="0" w:val="none"/>
+                <w:left w:color="000000" w:space="0" w:sz="0" w:val="none"/>
+                <w:bottom w:color="000000" w:space="0" w:sz="0" w:val="none"/>
+                <w:right w:color="000000" w:space="0" w:sz="0" w:val="none"/>
+                <w:between w:color="000000" w:space="0" w:sz="0" w:val="none"/>
               </w:pBdr>
               <w:spacing w:line="240" w:lineRule="auto"/>
               <w:rPr>
@@ -839,11 +858,11 @@
               <w:keepLines w:val="0"/>
               <w:widowControl w:val="0"/>
               <w:pBdr>
-                <w:top w:color="auto" w:space="0" w:sz="0" w:val="none"/>
-                <w:left w:color="auto" w:space="0" w:sz="0" w:val="none"/>
-                <w:bottom w:color="auto" w:space="0" w:sz="0" w:val="none"/>
-                <w:right w:color="auto" w:space="0" w:sz="0" w:val="none"/>
-                <w:between w:color="auto" w:space="0" w:sz="0" w:val="none"/>
+                <w:top w:color="000000" w:space="0" w:sz="0" w:val="none"/>
+                <w:left w:color="000000" w:space="0" w:sz="0" w:val="none"/>
+                <w:bottom w:color="000000" w:space="0" w:sz="0" w:val="none"/>
+                <w:right w:color="000000" w:space="0" w:sz="0" w:val="none"/>
+                <w:between w:color="000000" w:space="0" w:sz="0" w:val="none"/>
               </w:pBdr>
               <w:spacing w:line="240" w:lineRule="auto"/>
               <w:rPr>
@@ -880,11 +899,11 @@
               <w:keepLines w:val="0"/>
               <w:widowControl w:val="0"/>
               <w:pBdr>
-                <w:top w:color="auto" w:space="0" w:sz="0" w:val="none"/>
-                <w:left w:color="auto" w:space="0" w:sz="0" w:val="none"/>
-                <w:bottom w:color="auto" w:space="0" w:sz="0" w:val="none"/>
-                <w:right w:color="auto" w:space="0" w:sz="0" w:val="none"/>
-                <w:between w:color="auto" w:space="0" w:sz="0" w:val="none"/>
+                <w:top w:color="000000" w:space="0" w:sz="0" w:val="none"/>
+                <w:left w:color="000000" w:space="0" w:sz="0" w:val="none"/>
+                <w:bottom w:color="000000" w:space="0" w:sz="0" w:val="none"/>
+                <w:right w:color="000000" w:space="0" w:sz="0" w:val="none"/>
+                <w:between w:color="000000" w:space="0" w:sz="0" w:val="none"/>
               </w:pBdr>
               <w:spacing w:line="240" w:lineRule="auto"/>
               <w:rPr>
@@ -928,11 +947,11 @@
               <w:keepLines w:val="0"/>
               <w:widowControl w:val="0"/>
               <w:pBdr>
-                <w:top w:color="auto" w:space="0" w:sz="0" w:val="none"/>
-                <w:left w:color="auto" w:space="0" w:sz="0" w:val="none"/>
-                <w:bottom w:color="auto" w:space="0" w:sz="0" w:val="none"/>
-                <w:right w:color="auto" w:space="0" w:sz="0" w:val="none"/>
-                <w:between w:color="auto" w:space="0" w:sz="0" w:val="none"/>
+                <w:top w:color="000000" w:space="0" w:sz="0" w:val="none"/>
+                <w:left w:color="000000" w:space="0" w:sz="0" w:val="none"/>
+                <w:bottom w:color="000000" w:space="0" w:sz="0" w:val="none"/>
+                <w:right w:color="000000" w:space="0" w:sz="0" w:val="none"/>
+                <w:between w:color="000000" w:space="0" w:sz="0" w:val="none"/>
               </w:pBdr>
               <w:spacing w:line="240" w:lineRule="auto"/>
               <w:rPr>
@@ -970,11 +989,11 @@
               <w:keepLines w:val="0"/>
               <w:widowControl w:val="0"/>
               <w:pBdr>
-                <w:top w:color="auto" w:space="0" w:sz="0" w:val="none"/>
-                <w:left w:color="auto" w:space="0" w:sz="0" w:val="none"/>
-                <w:bottom w:color="auto" w:space="0" w:sz="0" w:val="none"/>
-                <w:right w:color="auto" w:space="0" w:sz="0" w:val="none"/>
-                <w:between w:color="auto" w:space="0" w:sz="0" w:val="none"/>
+                <w:top w:color="000000" w:space="0" w:sz="0" w:val="none"/>
+                <w:left w:color="000000" w:space="0" w:sz="0" w:val="none"/>
+                <w:bottom w:color="000000" w:space="0" w:sz="0" w:val="none"/>
+                <w:right w:color="000000" w:space="0" w:sz="0" w:val="none"/>
+                <w:between w:color="000000" w:space="0" w:sz="0" w:val="none"/>
               </w:pBdr>
               <w:spacing w:line="240" w:lineRule="auto"/>
               <w:rPr>
@@ -1012,11 +1031,11 @@
               <w:keepLines w:val="0"/>
               <w:widowControl w:val="0"/>
               <w:pBdr>
-                <w:top w:color="auto" w:space="0" w:sz="0" w:val="none"/>
-                <w:left w:color="auto" w:space="0" w:sz="0" w:val="none"/>
-                <w:bottom w:color="auto" w:space="0" w:sz="0" w:val="none"/>
-                <w:right w:color="auto" w:space="0" w:sz="0" w:val="none"/>
-                <w:between w:color="auto" w:space="0" w:sz="0" w:val="none"/>
+                <w:top w:color="000000" w:space="0" w:sz="0" w:val="none"/>
+                <w:left w:color="000000" w:space="0" w:sz="0" w:val="none"/>
+                <w:bottom w:color="000000" w:space="0" w:sz="0" w:val="none"/>
+                <w:right w:color="000000" w:space="0" w:sz="0" w:val="none"/>
+                <w:between w:color="000000" w:space="0" w:sz="0" w:val="none"/>
               </w:pBdr>
               <w:spacing w:line="240" w:lineRule="auto"/>
               <w:rPr>
@@ -1054,11 +1073,11 @@
               <w:keepLines w:val="0"/>
               <w:widowControl w:val="0"/>
               <w:pBdr>
-                <w:top w:color="auto" w:space="0" w:sz="0" w:val="none"/>
-                <w:left w:color="auto" w:space="0" w:sz="0" w:val="none"/>
-                <w:bottom w:color="auto" w:space="0" w:sz="0" w:val="none"/>
-                <w:right w:color="auto" w:space="0" w:sz="0" w:val="none"/>
-                <w:between w:color="auto" w:space="0" w:sz="0" w:val="none"/>
+                <w:top w:color="000000" w:space="0" w:sz="0" w:val="none"/>
+                <w:left w:color="000000" w:space="0" w:sz="0" w:val="none"/>
+                <w:bottom w:color="000000" w:space="0" w:sz="0" w:val="none"/>
+                <w:right w:color="000000" w:space="0" w:sz="0" w:val="none"/>
+                <w:between w:color="000000" w:space="0" w:sz="0" w:val="none"/>
               </w:pBdr>
               <w:spacing w:line="240" w:lineRule="auto"/>
               <w:rPr>
@@ -1103,11 +1122,11 @@
               <w:keepLines w:val="0"/>
               <w:widowControl w:val="0"/>
               <w:pBdr>
-                <w:top w:color="auto" w:space="0" w:sz="0" w:val="none"/>
-                <w:left w:color="auto" w:space="0" w:sz="0" w:val="none"/>
-                <w:bottom w:color="auto" w:space="0" w:sz="0" w:val="none"/>
-                <w:right w:color="auto" w:space="0" w:sz="0" w:val="none"/>
-                <w:between w:color="auto" w:space="0" w:sz="0" w:val="none"/>
+                <w:top w:color="000000" w:space="0" w:sz="0" w:val="none"/>
+                <w:left w:color="000000" w:space="0" w:sz="0" w:val="none"/>
+                <w:bottom w:color="000000" w:space="0" w:sz="0" w:val="none"/>
+                <w:right w:color="000000" w:space="0" w:sz="0" w:val="none"/>
+                <w:between w:color="000000" w:space="0" w:sz="0" w:val="none"/>
               </w:pBdr>
               <w:spacing w:line="240" w:lineRule="auto"/>
               <w:rPr>
@@ -1145,11 +1164,11 @@
               <w:keepLines w:val="0"/>
               <w:widowControl w:val="0"/>
               <w:pBdr>
-                <w:top w:color="auto" w:space="0" w:sz="0" w:val="none"/>
-                <w:left w:color="auto" w:space="0" w:sz="0" w:val="none"/>
-                <w:bottom w:color="auto" w:space="0" w:sz="0" w:val="none"/>
-                <w:right w:color="auto" w:space="0" w:sz="0" w:val="none"/>
-                <w:between w:color="auto" w:space="0" w:sz="0" w:val="none"/>
+                <w:top w:color="000000" w:space="0" w:sz="0" w:val="none"/>
+                <w:left w:color="000000" w:space="0" w:sz="0" w:val="none"/>
+                <w:bottom w:color="000000" w:space="0" w:sz="0" w:val="none"/>
+                <w:right w:color="000000" w:space="0" w:sz="0" w:val="none"/>
+                <w:between w:color="000000" w:space="0" w:sz="0" w:val="none"/>
               </w:pBdr>
               <w:spacing w:line="240" w:lineRule="auto"/>
               <w:rPr>
@@ -1187,11 +1206,11 @@
               <w:keepLines w:val="0"/>
               <w:widowControl w:val="0"/>
               <w:pBdr>
-                <w:top w:color="auto" w:space="0" w:sz="0" w:val="none"/>
-                <w:left w:color="auto" w:space="0" w:sz="0" w:val="none"/>
-                <w:bottom w:color="auto" w:space="0" w:sz="0" w:val="none"/>
-                <w:right w:color="auto" w:space="0" w:sz="0" w:val="none"/>
-                <w:between w:color="auto" w:space="0" w:sz="0" w:val="none"/>
+                <w:top w:color="000000" w:space="0" w:sz="0" w:val="none"/>
+                <w:left w:color="000000" w:space="0" w:sz="0" w:val="none"/>
+                <w:bottom w:color="000000" w:space="0" w:sz="0" w:val="none"/>
+                <w:right w:color="000000" w:space="0" w:sz="0" w:val="none"/>
+                <w:between w:color="000000" w:space="0" w:sz="0" w:val="none"/>
               </w:pBdr>
               <w:spacing w:line="240" w:lineRule="auto"/>
               <w:rPr>
@@ -1229,11 +1248,11 @@
               <w:keepLines w:val="0"/>
               <w:widowControl w:val="0"/>
               <w:pBdr>
-                <w:top w:color="auto" w:space="0" w:sz="0" w:val="none"/>
-                <w:left w:color="auto" w:space="0" w:sz="0" w:val="none"/>
-                <w:bottom w:color="auto" w:space="0" w:sz="0" w:val="none"/>
-                <w:right w:color="auto" w:space="0" w:sz="0" w:val="none"/>
-                <w:between w:color="auto" w:space="0" w:sz="0" w:val="none"/>
+                <w:top w:color="000000" w:space="0" w:sz="0" w:val="none"/>
+                <w:left w:color="000000" w:space="0" w:sz="0" w:val="none"/>
+                <w:bottom w:color="000000" w:space="0" w:sz="0" w:val="none"/>
+                <w:right w:color="000000" w:space="0" w:sz="0" w:val="none"/>
+                <w:between w:color="000000" w:space="0" w:sz="0" w:val="none"/>
               </w:pBdr>
               <w:spacing w:line="240" w:lineRule="auto"/>
               <w:rPr>
@@ -1278,11 +1297,11 @@
               <w:keepLines w:val="0"/>
               <w:widowControl w:val="0"/>
               <w:pBdr>
-                <w:top w:color="auto" w:space="0" w:sz="0" w:val="none"/>
-                <w:left w:color="auto" w:space="0" w:sz="0" w:val="none"/>
-                <w:bottom w:color="auto" w:space="0" w:sz="0" w:val="none"/>
-                <w:right w:color="auto" w:space="0" w:sz="0" w:val="none"/>
-                <w:between w:color="auto" w:space="0" w:sz="0" w:val="none"/>
+                <w:top w:color="000000" w:space="0" w:sz="0" w:val="none"/>
+                <w:left w:color="000000" w:space="0" w:sz="0" w:val="none"/>
+                <w:bottom w:color="000000" w:space="0" w:sz="0" w:val="none"/>
+                <w:right w:color="000000" w:space="0" w:sz="0" w:val="none"/>
+                <w:between w:color="000000" w:space="0" w:sz="0" w:val="none"/>
               </w:pBdr>
               <w:spacing w:line="240" w:lineRule="auto"/>
               <w:rPr>
@@ -1320,11 +1339,11 @@
               <w:keepLines w:val="0"/>
               <w:widowControl w:val="0"/>
               <w:pBdr>
-                <w:top w:color="auto" w:space="0" w:sz="0" w:val="none"/>
-                <w:left w:color="auto" w:space="0" w:sz="0" w:val="none"/>
-                <w:bottom w:color="auto" w:space="0" w:sz="0" w:val="none"/>
-                <w:right w:color="auto" w:space="0" w:sz="0" w:val="none"/>
-                <w:between w:color="auto" w:space="0" w:sz="0" w:val="none"/>
+                <w:top w:color="000000" w:space="0" w:sz="0" w:val="none"/>
+                <w:left w:color="000000" w:space="0" w:sz="0" w:val="none"/>
+                <w:bottom w:color="000000" w:space="0" w:sz="0" w:val="none"/>
+                <w:right w:color="000000" w:space="0" w:sz="0" w:val="none"/>
+                <w:between w:color="000000" w:space="0" w:sz="0" w:val="none"/>
               </w:pBdr>
               <w:spacing w:line="240" w:lineRule="auto"/>
               <w:rPr>
@@ -1362,11 +1381,11 @@
               <w:keepLines w:val="0"/>
               <w:widowControl w:val="0"/>
               <w:pBdr>
-                <w:top w:color="auto" w:space="0" w:sz="0" w:val="none"/>
-                <w:left w:color="auto" w:space="0" w:sz="0" w:val="none"/>
-                <w:bottom w:color="auto" w:space="0" w:sz="0" w:val="none"/>
-                <w:right w:color="auto" w:space="0" w:sz="0" w:val="none"/>
-                <w:between w:color="auto" w:space="0" w:sz="0" w:val="none"/>
+                <w:top w:color="000000" w:space="0" w:sz="0" w:val="none"/>
+                <w:left w:color="000000" w:space="0" w:sz="0" w:val="none"/>
+                <w:bottom w:color="000000" w:space="0" w:sz="0" w:val="none"/>
+                <w:right w:color="000000" w:space="0" w:sz="0" w:val="none"/>
+                <w:between w:color="000000" w:space="0" w:sz="0" w:val="none"/>
               </w:pBdr>
               <w:spacing w:line="240" w:lineRule="auto"/>
               <w:rPr>
@@ -1404,11 +1423,11 @@
               <w:keepLines w:val="0"/>
               <w:widowControl w:val="0"/>
               <w:pBdr>
-                <w:top w:color="auto" w:space="0" w:sz="0" w:val="none"/>
-                <w:left w:color="auto" w:space="0" w:sz="0" w:val="none"/>
-                <w:bottom w:color="auto" w:space="0" w:sz="0" w:val="none"/>
-                <w:right w:color="auto" w:space="0" w:sz="0" w:val="none"/>
-                <w:between w:color="auto" w:space="0" w:sz="0" w:val="none"/>
+                <w:top w:color="000000" w:space="0" w:sz="0" w:val="none"/>
+                <w:left w:color="000000" w:space="0" w:sz="0" w:val="none"/>
+                <w:bottom w:color="000000" w:space="0" w:sz="0" w:val="none"/>
+                <w:right w:color="000000" w:space="0" w:sz="0" w:val="none"/>
+                <w:between w:color="000000" w:space="0" w:sz="0" w:val="none"/>
               </w:pBdr>
               <w:spacing w:line="240" w:lineRule="auto"/>
               <w:rPr>
@@ -1444,11 +1463,11 @@
         <w:keepNext w:val="0"/>
         <w:keepLines w:val="0"/>
         <w:pBdr>
-          <w:top w:color="auto" w:space="0" w:sz="0" w:val="none"/>
-          <w:left w:color="auto" w:space="0" w:sz="0" w:val="none"/>
-          <w:bottom w:color="auto" w:space="0" w:sz="0" w:val="none"/>
-          <w:right w:color="auto" w:space="0" w:sz="0" w:val="none"/>
-          <w:between w:color="auto" w:space="0" w:sz="0" w:val="none"/>
+          <w:top w:color="000000" w:space="0" w:sz="0" w:val="none"/>
+          <w:left w:color="000000" w:space="0" w:sz="0" w:val="none"/>
+          <w:bottom w:color="000000" w:space="0" w:sz="0" w:val="none"/>
+          <w:right w:color="000000" w:space="0" w:sz="0" w:val="none"/>
+          <w:between w:color="000000" w:space="0" w:sz="0" w:val="none"/>
         </w:pBdr>
         <w:spacing w:after="0" w:before="0" w:lineRule="auto"/>
         <w:rPr>
@@ -1459,7 +1478,7 @@
           <w:szCs w:val="26"/>
         </w:rPr>
       </w:pPr>
-      <w:bookmarkStart w:colFirst="0" w:colLast="0" w:name="_7j34t2hha80a" w:id="6"/>
+      <w:bookmarkStart w:colFirst="0" w:colLast="0" w:name="_heading=h.tbv2jcolpgq3" w:id="6"/>
       <w:bookmarkEnd w:id="6"/>
       <w:r>
         <w:rPr>
@@ -1480,12 +1499,13 @@
           <w:numId w:val="6"/>
         </w:numPr>
         <w:pBdr>
-          <w:top w:color="auto" w:space="0" w:sz="0" w:val="none"/>
-          <w:bottom w:color="auto" w:space="0" w:sz="0" w:val="none"/>
-          <w:right w:color="auto" w:space="0" w:sz="0" w:val="none"/>
-          <w:between w:color="auto" w:space="0" w:sz="0" w:val="none"/>
+          <w:top w:color="000000" w:space="0" w:sz="0" w:val="none"/>
+          <w:bottom w:color="000000" w:space="0" w:sz="0" w:val="none"/>
+          <w:right w:color="000000" w:space="0" w:sz="0" w:val="none"/>
+          <w:between w:color="000000" w:space="0" w:sz="0" w:val="none"/>
         </w:pBdr>
         <w:ind w:left="720" w:hanging="360"/>
+        <w:rPr/>
       </w:pPr>
       <w:r>
         <w:rPr>
@@ -1501,7 +1521,12 @@
           <w:color w:val="1f1f1f"/>
           <w:rtl w:val="0"/>
         </w:rPr>
-        <w:t xml:space="preserve"> 13 Historias.</w:t>
+        <w:t xml:space="preserve"> 19 Historias.</w:t>
+      </w:r>
+      <w:r>
+        <w:rPr>
+          <w:rtl w:val="0"/>
+        </w:rPr>
       </w:r>
     </w:p>
     <w:p>
@@ -1511,12 +1536,13 @@
           <w:numId w:val="6"/>
         </w:numPr>
         <w:pBdr>
-          <w:top w:color="auto" w:space="0" w:sz="0" w:val="none"/>
-          <w:bottom w:color="auto" w:space="0" w:sz="0" w:val="none"/>
-          <w:right w:color="auto" w:space="0" w:sz="0" w:val="none"/>
-          <w:between w:color="auto" w:space="0" w:sz="0" w:val="none"/>
+          <w:top w:color="000000" w:space="0" w:sz="0" w:val="none"/>
+          <w:bottom w:color="000000" w:space="0" w:sz="0" w:val="none"/>
+          <w:right w:color="000000" w:space="0" w:sz="0" w:val="none"/>
+          <w:between w:color="000000" w:space="0" w:sz="0" w:val="none"/>
         </w:pBdr>
         <w:ind w:left="720" w:hanging="360"/>
+        <w:rPr/>
       </w:pPr>
       <w:r>
         <w:rPr>
@@ -1543,10 +1569,10 @@
     <w:p>
       <w:pPr>
         <w:pBdr>
-          <w:top w:color="auto" w:space="0" w:sz="0" w:val="none"/>
-          <w:bottom w:color="auto" w:space="0" w:sz="0" w:val="none"/>
-          <w:right w:color="auto" w:space="0" w:sz="0" w:val="none"/>
-          <w:between w:color="auto" w:space="0" w:sz="0" w:val="none"/>
+          <w:top w:color="000000" w:space="0" w:sz="0" w:val="none"/>
+          <w:bottom w:color="000000" w:space="0" w:sz="0" w:val="none"/>
+          <w:right w:color="000000" w:space="0" w:sz="0" w:val="none"/>
+          <w:between w:color="000000" w:space="0" w:sz="0" w:val="none"/>
         </w:pBdr>
         <w:ind w:left="0" w:firstLine="0"/>
         <w:rPr>
@@ -1565,11 +1591,11 @@
         <w:keepNext w:val="0"/>
         <w:keepLines w:val="0"/>
         <w:pBdr>
-          <w:top w:color="auto" w:space="0" w:sz="0" w:val="none"/>
-          <w:left w:color="auto" w:space="0" w:sz="0" w:val="none"/>
-          <w:bottom w:color="auto" w:space="0" w:sz="0" w:val="none"/>
-          <w:right w:color="auto" w:space="0" w:sz="0" w:val="none"/>
-          <w:between w:color="auto" w:space="0" w:sz="0" w:val="none"/>
+          <w:top w:color="000000" w:space="0" w:sz="0" w:val="none"/>
+          <w:left w:color="000000" w:space="0" w:sz="0" w:val="none"/>
+          <w:bottom w:color="000000" w:space="0" w:sz="0" w:val="none"/>
+          <w:right w:color="000000" w:space="0" w:sz="0" w:val="none"/>
+          <w:between w:color="000000" w:space="0" w:sz="0" w:val="none"/>
         </w:pBdr>
         <w:spacing w:after="0" w:before="0" w:lineRule="auto"/>
         <w:rPr>
@@ -1580,7 +1606,7 @@
           <w:szCs w:val="26"/>
         </w:rPr>
       </w:pPr>
-      <w:bookmarkStart w:colFirst="0" w:colLast="0" w:name="_9so4zjbelzq3" w:id="7"/>
+      <w:bookmarkStart w:colFirst="0" w:colLast="0" w:name="_heading=h.7f6l4yiulwki" w:id="7"/>
       <w:bookmarkEnd w:id="7"/>
       <w:r>
         <w:rPr>
@@ -1601,12 +1627,13 @@
           <w:numId w:val="8"/>
         </w:numPr>
         <w:pBdr>
-          <w:top w:color="auto" w:space="0" w:sz="0" w:val="none"/>
-          <w:bottom w:color="auto" w:space="0" w:sz="0" w:val="none"/>
-          <w:right w:color="auto" w:space="0" w:sz="0" w:val="none"/>
-          <w:between w:color="auto" w:space="0" w:sz="0" w:val="none"/>
+          <w:top w:color="000000" w:space="0" w:sz="0" w:val="none"/>
+          <w:bottom w:color="000000" w:space="0" w:sz="0" w:val="none"/>
+          <w:right w:color="000000" w:space="0" w:sz="0" w:val="none"/>
+          <w:between w:color="000000" w:space="0" w:sz="0" w:val="none"/>
         </w:pBdr>
         <w:ind w:left="720" w:hanging="360"/>
+        <w:rPr/>
       </w:pPr>
       <w:r>
         <w:rPr>
@@ -1655,6 +1682,11 @@
           <w:rtl w:val="0"/>
         </w:rPr>
         <w:t xml:space="preserve">. Ambos elementos dependen de servicios de hardware del dispositivo móvil y gateways de mensajería externa, por lo que deben ser abordadas en cuanto se estabilice el núcleo de autenticación.</w:t>
+      </w:r>
+      <w:r>
+        <w:rPr>
+          <w:rtl w:val="0"/>
+        </w:rPr>
       </w:r>
     </w:p>
     <w:p>
@@ -1664,12 +1696,13 @@
           <w:numId w:val="8"/>
         </w:numPr>
         <w:pBdr>
-          <w:top w:color="auto" w:space="0" w:sz="0" w:val="none"/>
-          <w:bottom w:color="auto" w:space="0" w:sz="0" w:val="none"/>
-          <w:right w:color="auto" w:space="0" w:sz="0" w:val="none"/>
-          <w:between w:color="auto" w:space="0" w:sz="0" w:val="none"/>
+          <w:top w:color="000000" w:space="0" w:sz="0" w:val="none"/>
+          <w:bottom w:color="000000" w:space="0" w:sz="0" w:val="none"/>
+          <w:right w:color="000000" w:space="0" w:sz="0" w:val="none"/>
+          <w:between w:color="000000" w:space="0" w:sz="0" w:val="none"/>
         </w:pBdr>
         <w:ind w:left="720" w:hanging="360"/>
+        <w:rPr/>
       </w:pPr>
       <w:r>
         <w:rPr>
@@ -1735,18 +1768,23 @@
         </w:rPr>
         <w:t xml:space="preserve">.</w:t>
       </w:r>
-    </w:p>
-    <w:p>
-      <w:pPr>
-        <w:pBdr>
-          <w:top w:color="auto" w:space="0" w:sz="0" w:val="none"/>
-          <w:left w:color="auto" w:space="0" w:sz="0" w:val="none"/>
-          <w:bottom w:color="auto" w:space="0" w:sz="0" w:val="none"/>
-          <w:right w:color="auto" w:space="0" w:sz="0" w:val="none"/>
-          <w:between w:color="auto" w:space="0" w:sz="0" w:val="none"/>
+      <w:r>
+        <w:rPr>
+          <w:rtl w:val="0"/>
+        </w:rPr>
+      </w:r>
+    </w:p>
+    <w:p>
+      <w:pPr>
+        <w:pBdr>
+          <w:top w:color="000000" w:space="0" w:sz="0" w:val="none"/>
+          <w:left w:color="000000" w:space="0" w:sz="0" w:val="none"/>
+          <w:bottom w:color="000000" w:space="0" w:sz="0" w:val="none"/>
+          <w:right w:color="000000" w:space="0" w:sz="0" w:val="none"/>
+          <w:between w:color="000000" w:space="0" w:sz="0" w:val="none"/>
         </w:pBdr>
         <w:shd w:fill="ffffff" w:val="clear"/>
-        <w:spacing w:after="120" w:before="240" w:line="259.20000000000005" w:lineRule="auto"/>
+        <w:spacing w:after="120" w:before="240" w:line="259.2000000000001" w:lineRule="auto"/>
         <w:ind w:left="0" w:firstLine="0"/>
         <w:rPr>
           <w:rFonts w:ascii="Calibri" w:cs="Calibri" w:eastAsia="Calibri" w:hAnsi="Calibri"/>
@@ -1831,11 +1869,11 @@
             <w:pPr>
               <w:widowControl w:val="0"/>
               <w:pBdr>
-                <w:top w:color="auto" w:space="0" w:sz="0" w:val="none"/>
-                <w:left w:color="auto" w:space="0" w:sz="0" w:val="none"/>
-                <w:bottom w:color="auto" w:space="0" w:sz="0" w:val="none"/>
-                <w:right w:color="auto" w:space="0" w:sz="0" w:val="none"/>
-                <w:between w:color="auto" w:space="0" w:sz="0" w:val="none"/>
+                <w:top w:color="000000" w:space="0" w:sz="0" w:val="none"/>
+                <w:left w:color="000000" w:space="0" w:sz="0" w:val="none"/>
+                <w:bottom w:color="000000" w:space="0" w:sz="0" w:val="none"/>
+                <w:right w:color="000000" w:space="0" w:sz="0" w:val="none"/>
+                <w:between w:color="000000" w:space="0" w:sz="0" w:val="none"/>
               </w:pBdr>
               <w:spacing w:line="240" w:lineRule="auto"/>
               <w:jc w:val="center"/>
@@ -1875,11 +1913,11 @@
             <w:pPr>
               <w:widowControl w:val="0"/>
               <w:pBdr>
-                <w:top w:color="auto" w:space="0" w:sz="0" w:val="none"/>
-                <w:left w:color="auto" w:space="0" w:sz="0" w:val="none"/>
-                <w:bottom w:color="auto" w:space="0" w:sz="0" w:val="none"/>
-                <w:right w:color="auto" w:space="0" w:sz="0" w:val="none"/>
-                <w:between w:color="auto" w:space="0" w:sz="0" w:val="none"/>
+                <w:top w:color="000000" w:space="0" w:sz="0" w:val="none"/>
+                <w:left w:color="000000" w:space="0" w:sz="0" w:val="none"/>
+                <w:bottom w:color="000000" w:space="0" w:sz="0" w:val="none"/>
+                <w:right w:color="000000" w:space="0" w:sz="0" w:val="none"/>
+                <w:between w:color="000000" w:space="0" w:sz="0" w:val="none"/>
               </w:pBdr>
               <w:spacing w:line="240" w:lineRule="auto"/>
               <w:jc w:val="center"/>
@@ -1919,11 +1957,11 @@
             <w:pPr>
               <w:widowControl w:val="0"/>
               <w:pBdr>
-                <w:top w:color="auto" w:space="0" w:sz="0" w:val="none"/>
-                <w:left w:color="auto" w:space="0" w:sz="0" w:val="none"/>
-                <w:bottom w:color="auto" w:space="0" w:sz="0" w:val="none"/>
-                <w:right w:color="auto" w:space="0" w:sz="0" w:val="none"/>
-                <w:between w:color="auto" w:space="0" w:sz="0" w:val="none"/>
+                <w:top w:color="000000" w:space="0" w:sz="0" w:val="none"/>
+                <w:left w:color="000000" w:space="0" w:sz="0" w:val="none"/>
+                <w:bottom w:color="000000" w:space="0" w:sz="0" w:val="none"/>
+                <w:right w:color="000000" w:space="0" w:sz="0" w:val="none"/>
+                <w:between w:color="000000" w:space="0" w:sz="0" w:val="none"/>
               </w:pBdr>
               <w:spacing w:line="240" w:lineRule="auto"/>
               <w:jc w:val="center"/>
@@ -1963,11 +2001,11 @@
             <w:pPr>
               <w:widowControl w:val="0"/>
               <w:pBdr>
-                <w:top w:color="auto" w:space="0" w:sz="0" w:val="none"/>
-                <w:left w:color="auto" w:space="0" w:sz="0" w:val="none"/>
-                <w:bottom w:color="auto" w:space="0" w:sz="0" w:val="none"/>
-                <w:right w:color="auto" w:space="0" w:sz="0" w:val="none"/>
-                <w:between w:color="auto" w:space="0" w:sz="0" w:val="none"/>
+                <w:top w:color="000000" w:space="0" w:sz="0" w:val="none"/>
+                <w:left w:color="000000" w:space="0" w:sz="0" w:val="none"/>
+                <w:bottom w:color="000000" w:space="0" w:sz="0" w:val="none"/>
+                <w:right w:color="000000" w:space="0" w:sz="0" w:val="none"/>
+                <w:between w:color="000000" w:space="0" w:sz="0" w:val="none"/>
               </w:pBdr>
               <w:spacing w:line="240" w:lineRule="auto"/>
               <w:jc w:val="center"/>
@@ -2013,11 +2051,11 @@
             <w:pPr>
               <w:widowControl w:val="0"/>
               <w:pBdr>
-                <w:top w:color="auto" w:space="0" w:sz="0" w:val="none"/>
-                <w:left w:color="auto" w:space="0" w:sz="0" w:val="none"/>
-                <w:bottom w:color="auto" w:space="0" w:sz="0" w:val="none"/>
-                <w:right w:color="auto" w:space="0" w:sz="0" w:val="none"/>
-                <w:between w:color="auto" w:space="0" w:sz="0" w:val="none"/>
+                <w:top w:color="000000" w:space="0" w:sz="0" w:val="none"/>
+                <w:left w:color="000000" w:space="0" w:sz="0" w:val="none"/>
+                <w:bottom w:color="000000" w:space="0" w:sz="0" w:val="none"/>
+                <w:right w:color="000000" w:space="0" w:sz="0" w:val="none"/>
+                <w:between w:color="000000" w:space="0" w:sz="0" w:val="none"/>
               </w:pBdr>
               <w:spacing w:line="240" w:lineRule="auto"/>
               <w:jc w:val="center"/>
@@ -2051,11 +2089,11 @@
             <w:pPr>
               <w:widowControl w:val="0"/>
               <w:pBdr>
-                <w:top w:color="auto" w:space="0" w:sz="0" w:val="none"/>
-                <w:left w:color="auto" w:space="0" w:sz="0" w:val="none"/>
-                <w:bottom w:color="auto" w:space="0" w:sz="0" w:val="none"/>
-                <w:right w:color="auto" w:space="0" w:sz="0" w:val="none"/>
-                <w:between w:color="auto" w:space="0" w:sz="0" w:val="none"/>
+                <w:top w:color="000000" w:space="0" w:sz="0" w:val="none"/>
+                <w:left w:color="000000" w:space="0" w:sz="0" w:val="none"/>
+                <w:bottom w:color="000000" w:space="0" w:sz="0" w:val="none"/>
+                <w:right w:color="000000" w:space="0" w:sz="0" w:val="none"/>
+                <w:between w:color="000000" w:space="0" w:sz="0" w:val="none"/>
               </w:pBdr>
               <w:spacing w:line="240" w:lineRule="auto"/>
               <w:jc w:val="center"/>
@@ -2089,11 +2127,11 @@
             <w:pPr>
               <w:widowControl w:val="0"/>
               <w:pBdr>
-                <w:top w:color="auto" w:space="0" w:sz="0" w:val="none"/>
-                <w:left w:color="auto" w:space="0" w:sz="0" w:val="none"/>
-                <w:bottom w:color="auto" w:space="0" w:sz="0" w:val="none"/>
-                <w:right w:color="auto" w:space="0" w:sz="0" w:val="none"/>
-                <w:between w:color="auto" w:space="0" w:sz="0" w:val="none"/>
+                <w:top w:color="000000" w:space="0" w:sz="0" w:val="none"/>
+                <w:left w:color="000000" w:space="0" w:sz="0" w:val="none"/>
+                <w:bottom w:color="000000" w:space="0" w:sz="0" w:val="none"/>
+                <w:right w:color="000000" w:space="0" w:sz="0" w:val="none"/>
+                <w:between w:color="000000" w:space="0" w:sz="0" w:val="none"/>
               </w:pBdr>
               <w:spacing w:line="240" w:lineRule="auto"/>
               <w:jc w:val="center"/>
@@ -2128,11 +2166,11 @@
             <w:pPr>
               <w:widowControl w:val="0"/>
               <w:pBdr>
-                <w:top w:color="auto" w:space="0" w:sz="0" w:val="none"/>
-                <w:left w:color="auto" w:space="0" w:sz="0" w:val="none"/>
-                <w:bottom w:color="auto" w:space="0" w:sz="0" w:val="none"/>
-                <w:right w:color="auto" w:space="0" w:sz="0" w:val="none"/>
-                <w:between w:color="auto" w:space="0" w:sz="0" w:val="none"/>
+                <w:top w:color="000000" w:space="0" w:sz="0" w:val="none"/>
+                <w:left w:color="000000" w:space="0" w:sz="0" w:val="none"/>
+                <w:bottom w:color="000000" w:space="0" w:sz="0" w:val="none"/>
+                <w:right w:color="000000" w:space="0" w:sz="0" w:val="none"/>
+                <w:between w:color="000000" w:space="0" w:sz="0" w:val="none"/>
               </w:pBdr>
               <w:spacing w:line="240" w:lineRule="auto"/>
               <w:jc w:val="center"/>
@@ -2174,11 +2212,11 @@
             <w:pPr>
               <w:widowControl w:val="0"/>
               <w:pBdr>
-                <w:top w:color="auto" w:space="0" w:sz="0" w:val="none"/>
-                <w:left w:color="auto" w:space="0" w:sz="0" w:val="none"/>
-                <w:bottom w:color="auto" w:space="0" w:sz="0" w:val="none"/>
-                <w:right w:color="auto" w:space="0" w:sz="0" w:val="none"/>
-                <w:between w:color="auto" w:space="0" w:sz="0" w:val="none"/>
+                <w:top w:color="000000" w:space="0" w:sz="0" w:val="none"/>
+                <w:left w:color="000000" w:space="0" w:sz="0" w:val="none"/>
+                <w:bottom w:color="000000" w:space="0" w:sz="0" w:val="none"/>
+                <w:right w:color="000000" w:space="0" w:sz="0" w:val="none"/>
+                <w:between w:color="000000" w:space="0" w:sz="0" w:val="none"/>
               </w:pBdr>
               <w:spacing w:line="240" w:lineRule="auto"/>
               <w:jc w:val="center"/>
@@ -2213,11 +2251,11 @@
             <w:pPr>
               <w:widowControl w:val="0"/>
               <w:pBdr>
-                <w:top w:color="auto" w:space="0" w:sz="0" w:val="none"/>
-                <w:left w:color="auto" w:space="0" w:sz="0" w:val="none"/>
-                <w:bottom w:color="auto" w:space="0" w:sz="0" w:val="none"/>
-                <w:right w:color="auto" w:space="0" w:sz="0" w:val="none"/>
-                <w:between w:color="auto" w:space="0" w:sz="0" w:val="none"/>
+                <w:top w:color="000000" w:space="0" w:sz="0" w:val="none"/>
+                <w:left w:color="000000" w:space="0" w:sz="0" w:val="none"/>
+                <w:bottom w:color="000000" w:space="0" w:sz="0" w:val="none"/>
+                <w:right w:color="000000" w:space="0" w:sz="0" w:val="none"/>
+                <w:between w:color="000000" w:space="0" w:sz="0" w:val="none"/>
               </w:pBdr>
               <w:spacing w:line="240" w:lineRule="auto"/>
               <w:jc w:val="center"/>
@@ -2252,11 +2290,11 @@
             <w:pPr>
               <w:widowControl w:val="0"/>
               <w:pBdr>
-                <w:top w:color="auto" w:space="0" w:sz="0" w:val="none"/>
-                <w:left w:color="auto" w:space="0" w:sz="0" w:val="none"/>
-                <w:bottom w:color="auto" w:space="0" w:sz="0" w:val="none"/>
-                <w:right w:color="auto" w:space="0" w:sz="0" w:val="none"/>
-                <w:between w:color="auto" w:space="0" w:sz="0" w:val="none"/>
+                <w:top w:color="000000" w:space="0" w:sz="0" w:val="none"/>
+                <w:left w:color="000000" w:space="0" w:sz="0" w:val="none"/>
+                <w:bottom w:color="000000" w:space="0" w:sz="0" w:val="none"/>
+                <w:right w:color="000000" w:space="0" w:sz="0" w:val="none"/>
+                <w:between w:color="000000" w:space="0" w:sz="0" w:val="none"/>
               </w:pBdr>
               <w:spacing w:line="240" w:lineRule="auto"/>
               <w:jc w:val="center"/>
@@ -2291,11 +2329,11 @@
             <w:pPr>
               <w:widowControl w:val="0"/>
               <w:pBdr>
-                <w:top w:color="auto" w:space="0" w:sz="0" w:val="none"/>
-                <w:left w:color="auto" w:space="0" w:sz="0" w:val="none"/>
-                <w:bottom w:color="auto" w:space="0" w:sz="0" w:val="none"/>
-                <w:right w:color="auto" w:space="0" w:sz="0" w:val="none"/>
-                <w:between w:color="auto" w:space="0" w:sz="0" w:val="none"/>
+                <w:top w:color="000000" w:space="0" w:sz="0" w:val="none"/>
+                <w:left w:color="000000" w:space="0" w:sz="0" w:val="none"/>
+                <w:bottom w:color="000000" w:space="0" w:sz="0" w:val="none"/>
+                <w:right w:color="000000" w:space="0" w:sz="0" w:val="none"/>
+                <w:between w:color="000000" w:space="0" w:sz="0" w:val="none"/>
               </w:pBdr>
               <w:spacing w:line="240" w:lineRule="auto"/>
               <w:jc w:val="center"/>
@@ -2336,11 +2374,11 @@
             <w:pPr>
               <w:widowControl w:val="0"/>
               <w:pBdr>
-                <w:top w:color="auto" w:space="0" w:sz="0" w:val="none"/>
-                <w:left w:color="auto" w:space="0" w:sz="0" w:val="none"/>
-                <w:bottom w:color="auto" w:space="0" w:sz="0" w:val="none"/>
-                <w:right w:color="auto" w:space="0" w:sz="0" w:val="none"/>
-                <w:between w:color="auto" w:space="0" w:sz="0" w:val="none"/>
+                <w:top w:color="000000" w:space="0" w:sz="0" w:val="none"/>
+                <w:left w:color="000000" w:space="0" w:sz="0" w:val="none"/>
+                <w:bottom w:color="000000" w:space="0" w:sz="0" w:val="none"/>
+                <w:right w:color="000000" w:space="0" w:sz="0" w:val="none"/>
+                <w:between w:color="000000" w:space="0" w:sz="0" w:val="none"/>
               </w:pBdr>
               <w:spacing w:line="240" w:lineRule="auto"/>
               <w:jc w:val="center"/>
@@ -2374,11 +2412,11 @@
             <w:pPr>
               <w:widowControl w:val="0"/>
               <w:pBdr>
-                <w:top w:color="auto" w:space="0" w:sz="0" w:val="none"/>
-                <w:left w:color="auto" w:space="0" w:sz="0" w:val="none"/>
-                <w:bottom w:color="auto" w:space="0" w:sz="0" w:val="none"/>
-                <w:right w:color="auto" w:space="0" w:sz="0" w:val="none"/>
-                <w:between w:color="auto" w:space="0" w:sz="0" w:val="none"/>
+                <w:top w:color="000000" w:space="0" w:sz="0" w:val="none"/>
+                <w:left w:color="000000" w:space="0" w:sz="0" w:val="none"/>
+                <w:bottom w:color="000000" w:space="0" w:sz="0" w:val="none"/>
+                <w:right w:color="000000" w:space="0" w:sz="0" w:val="none"/>
+                <w:between w:color="000000" w:space="0" w:sz="0" w:val="none"/>
               </w:pBdr>
               <w:spacing w:line="240" w:lineRule="auto"/>
               <w:jc w:val="center"/>
@@ -2412,11 +2450,11 @@
             <w:pPr>
               <w:widowControl w:val="0"/>
               <w:pBdr>
-                <w:top w:color="auto" w:space="0" w:sz="0" w:val="none"/>
-                <w:left w:color="auto" w:space="0" w:sz="0" w:val="none"/>
-                <w:bottom w:color="auto" w:space="0" w:sz="0" w:val="none"/>
-                <w:right w:color="auto" w:space="0" w:sz="0" w:val="none"/>
-                <w:between w:color="auto" w:space="0" w:sz="0" w:val="none"/>
+                <w:top w:color="000000" w:space="0" w:sz="0" w:val="none"/>
+                <w:left w:color="000000" w:space="0" w:sz="0" w:val="none"/>
+                <w:bottom w:color="000000" w:space="0" w:sz="0" w:val="none"/>
+                <w:right w:color="000000" w:space="0" w:sz="0" w:val="none"/>
+                <w:between w:color="000000" w:space="0" w:sz="0" w:val="none"/>
               </w:pBdr>
               <w:spacing w:line="240" w:lineRule="auto"/>
               <w:jc w:val="center"/>
@@ -2450,11 +2488,11 @@
             <w:pPr>
               <w:widowControl w:val="0"/>
               <w:pBdr>
-                <w:top w:color="auto" w:space="0" w:sz="0" w:val="none"/>
-                <w:left w:color="auto" w:space="0" w:sz="0" w:val="none"/>
-                <w:bottom w:color="auto" w:space="0" w:sz="0" w:val="none"/>
-                <w:right w:color="auto" w:space="0" w:sz="0" w:val="none"/>
-                <w:between w:color="auto" w:space="0" w:sz="0" w:val="none"/>
+                <w:top w:color="000000" w:space="0" w:sz="0" w:val="none"/>
+                <w:left w:color="000000" w:space="0" w:sz="0" w:val="none"/>
+                <w:bottom w:color="000000" w:space="0" w:sz="0" w:val="none"/>
+                <w:right w:color="000000" w:space="0" w:sz="0" w:val="none"/>
+                <w:between w:color="000000" w:space="0" w:sz="0" w:val="none"/>
               </w:pBdr>
               <w:spacing w:line="240" w:lineRule="auto"/>
               <w:jc w:val="center"/>
@@ -2464,19 +2502,7 @@
               <w:rPr>
                 <w:rtl w:val="0"/>
               </w:rPr>
-              <w:t xml:space="preserve">Wireframes </w:t>
-            </w:r>
-            <w:r>
-              <w:rPr>
-                <w:rtl w:val="0"/>
-              </w:rPr>
-              <w:t xml:space="preserve">o Mockups</w:t>
-            </w:r>
-            <w:r>
-              <w:rPr>
-                <w:rtl w:val="0"/>
-              </w:rPr>
-              <w:t xml:space="preserve">; Diagrama UML; Especificación de Herramientas y Servicios del Proyecto; Arquitectura</w:t>
+              <w:t xml:space="preserve">Wireframes o Mockups; Diagrama UML; Especificación de Herramientas y Servicios del Proyecto; Arquitectura</w:t>
             </w:r>
           </w:p>
         </w:tc>
@@ -2508,11 +2534,11 @@
             <w:pPr>
               <w:widowControl w:val="0"/>
               <w:pBdr>
-                <w:top w:color="auto" w:space="0" w:sz="0" w:val="none"/>
-                <w:left w:color="auto" w:space="0" w:sz="0" w:val="none"/>
-                <w:bottom w:color="auto" w:space="0" w:sz="0" w:val="none"/>
-                <w:right w:color="auto" w:space="0" w:sz="0" w:val="none"/>
-                <w:between w:color="auto" w:space="0" w:sz="0" w:val="none"/>
+                <w:top w:color="000000" w:space="0" w:sz="0" w:val="none"/>
+                <w:left w:color="000000" w:space="0" w:sz="0" w:val="none"/>
+                <w:bottom w:color="000000" w:space="0" w:sz="0" w:val="none"/>
+                <w:right w:color="000000" w:space="0" w:sz="0" w:val="none"/>
+                <w:between w:color="000000" w:space="0" w:sz="0" w:val="none"/>
               </w:pBdr>
               <w:spacing w:line="240" w:lineRule="auto"/>
               <w:jc w:val="center"/>
@@ -2547,11 +2573,11 @@
             <w:pPr>
               <w:widowControl w:val="0"/>
               <w:pBdr>
-                <w:top w:color="auto" w:space="0" w:sz="0" w:val="none"/>
-                <w:left w:color="auto" w:space="0" w:sz="0" w:val="none"/>
-                <w:bottom w:color="auto" w:space="0" w:sz="0" w:val="none"/>
-                <w:right w:color="auto" w:space="0" w:sz="0" w:val="none"/>
-                <w:between w:color="auto" w:space="0" w:sz="0" w:val="none"/>
+                <w:top w:color="000000" w:space="0" w:sz="0" w:val="none"/>
+                <w:left w:color="000000" w:space="0" w:sz="0" w:val="none"/>
+                <w:bottom w:color="000000" w:space="0" w:sz="0" w:val="none"/>
+                <w:right w:color="000000" w:space="0" w:sz="0" w:val="none"/>
+                <w:between w:color="000000" w:space="0" w:sz="0" w:val="none"/>
               </w:pBdr>
               <w:spacing w:line="240" w:lineRule="auto"/>
               <w:jc w:val="center"/>
@@ -2586,11 +2612,11 @@
             <w:pPr>
               <w:widowControl w:val="0"/>
               <w:pBdr>
-                <w:top w:color="auto" w:space="0" w:sz="0" w:val="none"/>
-                <w:left w:color="auto" w:space="0" w:sz="0" w:val="none"/>
-                <w:bottom w:color="auto" w:space="0" w:sz="0" w:val="none"/>
-                <w:right w:color="auto" w:space="0" w:sz="0" w:val="none"/>
-                <w:between w:color="auto" w:space="0" w:sz="0" w:val="none"/>
+                <w:top w:color="000000" w:space="0" w:sz="0" w:val="none"/>
+                <w:left w:color="000000" w:space="0" w:sz="0" w:val="none"/>
+                <w:bottom w:color="000000" w:space="0" w:sz="0" w:val="none"/>
+                <w:right w:color="000000" w:space="0" w:sz="0" w:val="none"/>
+                <w:between w:color="000000" w:space="0" w:sz="0" w:val="none"/>
               </w:pBdr>
               <w:spacing w:line="240" w:lineRule="auto"/>
               <w:jc w:val="center"/>
@@ -2625,11 +2651,11 @@
             <w:pPr>
               <w:widowControl w:val="0"/>
               <w:pBdr>
-                <w:top w:color="auto" w:space="0" w:sz="0" w:val="none"/>
-                <w:left w:color="auto" w:space="0" w:sz="0" w:val="none"/>
-                <w:bottom w:color="auto" w:space="0" w:sz="0" w:val="none"/>
-                <w:right w:color="auto" w:space="0" w:sz="0" w:val="none"/>
-                <w:between w:color="auto" w:space="0" w:sz="0" w:val="none"/>
+                <w:top w:color="000000" w:space="0" w:sz="0" w:val="none"/>
+                <w:left w:color="000000" w:space="0" w:sz="0" w:val="none"/>
+                <w:bottom w:color="000000" w:space="0" w:sz="0" w:val="none"/>
+                <w:right w:color="000000" w:space="0" w:sz="0" w:val="none"/>
+                <w:between w:color="000000" w:space="0" w:sz="0" w:val="none"/>
               </w:pBdr>
               <w:spacing w:line="240" w:lineRule="auto"/>
               <w:jc w:val="center"/>
@@ -2648,10 +2674,10 @@
     <w:p>
       <w:pPr>
         <w:pBdr>
-          <w:top w:color="auto" w:space="0" w:sz="0" w:val="none"/>
-          <w:bottom w:color="auto" w:space="0" w:sz="0" w:val="none"/>
-          <w:right w:color="auto" w:space="0" w:sz="0" w:val="none"/>
-          <w:between w:color="auto" w:space="0" w:sz="0" w:val="none"/>
+          <w:top w:color="000000" w:space="0" w:sz="0" w:val="none"/>
+          <w:bottom w:color="000000" w:space="0" w:sz="0" w:val="none"/>
+          <w:right w:color="000000" w:space="0" w:sz="0" w:val="none"/>
+          <w:between w:color="000000" w:space="0" w:sz="0" w:val="none"/>
         </w:pBdr>
         <w:ind w:left="0" w:firstLine="0"/>
         <w:rPr>
@@ -2667,10 +2693,118 @@
     <w:p>
       <w:pPr>
         <w:pBdr>
-          <w:top w:color="auto" w:space="0" w:sz="0" w:val="none"/>
-          <w:bottom w:color="auto" w:space="0" w:sz="0" w:val="none"/>
-          <w:right w:color="auto" w:space="0" w:sz="0" w:val="none"/>
-          <w:between w:color="auto" w:space="0" w:sz="0" w:val="none"/>
+          <w:top w:color="000000" w:space="0" w:sz="0" w:val="none"/>
+          <w:bottom w:color="000000" w:space="0" w:sz="0" w:val="none"/>
+          <w:right w:color="000000" w:space="0" w:sz="0" w:val="none"/>
+          <w:between w:color="000000" w:space="0" w:sz="0" w:val="none"/>
+        </w:pBdr>
+        <w:rPr>
+          <w:color w:val="1f1f1f"/>
+        </w:rPr>
+      </w:pPr>
+      <w:r>
+        <w:rPr>
+          <w:rtl w:val="0"/>
+        </w:rPr>
+      </w:r>
+    </w:p>
+    <w:p>
+      <w:pPr>
+        <w:pBdr>
+          <w:top w:color="000000" w:space="0" w:sz="0" w:val="none"/>
+          <w:bottom w:color="000000" w:space="0" w:sz="0" w:val="none"/>
+          <w:right w:color="000000" w:space="0" w:sz="0" w:val="none"/>
+          <w:between w:color="000000" w:space="0" w:sz="0" w:val="none"/>
+        </w:pBdr>
+        <w:rPr>
+          <w:color w:val="1f1f1f"/>
+        </w:rPr>
+      </w:pPr>
+      <w:r>
+        <w:rPr>
+          <w:rtl w:val="0"/>
+        </w:rPr>
+      </w:r>
+    </w:p>
+    <w:p>
+      <w:pPr>
+        <w:pBdr>
+          <w:top w:color="000000" w:space="0" w:sz="0" w:val="none"/>
+          <w:bottom w:color="000000" w:space="0" w:sz="0" w:val="none"/>
+          <w:right w:color="000000" w:space="0" w:sz="0" w:val="none"/>
+          <w:between w:color="000000" w:space="0" w:sz="0" w:val="none"/>
+        </w:pBdr>
+        <w:rPr>
+          <w:color w:val="1f1f1f"/>
+        </w:rPr>
+      </w:pPr>
+      <w:r>
+        <w:rPr>
+          <w:rtl w:val="0"/>
+        </w:rPr>
+      </w:r>
+    </w:p>
+    <w:p>
+      <w:pPr>
+        <w:pBdr>
+          <w:top w:color="000000" w:space="0" w:sz="0" w:val="none"/>
+          <w:bottom w:color="000000" w:space="0" w:sz="0" w:val="none"/>
+          <w:right w:color="000000" w:space="0" w:sz="0" w:val="none"/>
+          <w:between w:color="000000" w:space="0" w:sz="0" w:val="none"/>
+        </w:pBdr>
+        <w:rPr>
+          <w:color w:val="1f1f1f"/>
+        </w:rPr>
+      </w:pPr>
+      <w:r>
+        <w:rPr>
+          <w:rtl w:val="0"/>
+        </w:rPr>
+      </w:r>
+    </w:p>
+    <w:p>
+      <w:pPr>
+        <w:pBdr>
+          <w:top w:color="000000" w:space="0" w:sz="0" w:val="none"/>
+          <w:bottom w:color="000000" w:space="0" w:sz="0" w:val="none"/>
+          <w:right w:color="000000" w:space="0" w:sz="0" w:val="none"/>
+          <w:between w:color="000000" w:space="0" w:sz="0" w:val="none"/>
+        </w:pBdr>
+        <w:rPr>
+          <w:color w:val="1f1f1f"/>
+        </w:rPr>
+      </w:pPr>
+      <w:r>
+        <w:rPr>
+          <w:rtl w:val="0"/>
+        </w:rPr>
+      </w:r>
+    </w:p>
+    <w:p>
+      <w:pPr>
+        <w:pBdr>
+          <w:top w:color="000000" w:space="0" w:sz="0" w:val="none"/>
+          <w:bottom w:color="000000" w:space="0" w:sz="0" w:val="none"/>
+          <w:right w:color="000000" w:space="0" w:sz="0" w:val="none"/>
+          <w:between w:color="000000" w:space="0" w:sz="0" w:val="none"/>
+        </w:pBdr>
+        <w:rPr>
+          <w:color w:val="1f1f1f"/>
+        </w:rPr>
+      </w:pPr>
+      <w:r>
+        <w:rPr>
+          <w:rtl w:val="0"/>
+        </w:rPr>
+      </w:r>
+    </w:p>
+    <w:p>
+      <w:pPr>
+        <w:pBdr>
+          <w:top w:color="000000" w:space="0" w:sz="0" w:val="none"/>
+          <w:bottom w:color="000000" w:space="0" w:sz="0" w:val="none"/>
+          <w:right w:color="000000" w:space="0" w:sz="0" w:val="none"/>
+          <w:between w:color="000000" w:space="0" w:sz="0" w:val="none"/>
         </w:pBdr>
         <w:rPr>
           <w:color w:val="1f1f1f"/>
@@ -2688,11 +2822,11 @@
         <w:keepNext w:val="0"/>
         <w:keepLines w:val="0"/>
         <w:pBdr>
-          <w:top w:color="auto" w:space="0" w:sz="0" w:val="none"/>
-          <w:left w:color="auto" w:space="0" w:sz="0" w:val="none"/>
-          <w:bottom w:color="auto" w:space="0" w:sz="0" w:val="none"/>
-          <w:right w:color="auto" w:space="0" w:sz="0" w:val="none"/>
-          <w:between w:color="auto" w:space="0" w:sz="0" w:val="none"/>
+          <w:top w:color="000000" w:space="0" w:sz="0" w:val="none"/>
+          <w:left w:color="000000" w:space="0" w:sz="0" w:val="none"/>
+          <w:bottom w:color="000000" w:space="0" w:sz="0" w:val="none"/>
+          <w:right w:color="000000" w:space="0" w:sz="0" w:val="none"/>
+          <w:between w:color="000000" w:space="0" w:sz="0" w:val="none"/>
         </w:pBdr>
         <w:spacing w:after="0" w:before="0" w:lineRule="auto"/>
         <w:rPr>
@@ -2703,7 +2837,7 @@
           <w:szCs w:val="34"/>
         </w:rPr>
       </w:pPr>
-      <w:bookmarkStart w:colFirst="0" w:colLast="0" w:name="_yf87bh5bmzwq" w:id="8"/>
+      <w:bookmarkStart w:colFirst="0" w:colLast="0" w:name="_heading=h.bntypolmega0" w:id="8"/>
       <w:bookmarkEnd w:id="8"/>
       <w:r>
         <w:rPr>
@@ -2750,12 +2884,13 @@
           <w:numId w:val="3"/>
         </w:numPr>
         <w:pBdr>
-          <w:top w:color="auto" w:space="0" w:sz="0" w:val="none"/>
-          <w:bottom w:color="auto" w:space="0" w:sz="0" w:val="none"/>
-          <w:right w:color="auto" w:space="0" w:sz="0" w:val="none"/>
-          <w:between w:color="auto" w:space="0" w:sz="0" w:val="none"/>
+          <w:top w:color="000000" w:space="0" w:sz="0" w:val="none"/>
+          <w:bottom w:color="000000" w:space="0" w:sz="0" w:val="none"/>
+          <w:right w:color="000000" w:space="0" w:sz="0" w:val="none"/>
+          <w:between w:color="000000" w:space="0" w:sz="0" w:val="none"/>
         </w:pBdr>
         <w:ind w:left="720" w:hanging="360"/>
+        <w:rPr/>
       </w:pPr>
       <w:r>
         <w:rPr>
@@ -2788,6 +2923,11 @@
           <w:rtl w:val="0"/>
         </w:rPr>
         <w:t xml:space="preserve"> se desarrollan en los primeros Sprints de la Fase 2. Los Sprints 1 al 4 de la Fase 1 establecen la base documental y técnica del proyecto.</w:t>
+      </w:r>
+      <w:r>
+        <w:rPr>
+          <w:rtl w:val="0"/>
+        </w:rPr>
       </w:r>
     </w:p>
     <w:p>
@@ -2797,12 +2937,13 @@
           <w:numId w:val="3"/>
         </w:numPr>
         <w:pBdr>
-          <w:top w:color="auto" w:space="0" w:sz="0" w:val="none"/>
-          <w:bottom w:color="auto" w:space="0" w:sz="0" w:val="none"/>
-          <w:right w:color="auto" w:space="0" w:sz="0" w:val="none"/>
-          <w:between w:color="auto" w:space="0" w:sz="0" w:val="none"/>
+          <w:top w:color="000000" w:space="0" w:sz="0" w:val="none"/>
+          <w:bottom w:color="000000" w:space="0" w:sz="0" w:val="none"/>
+          <w:right w:color="000000" w:space="0" w:sz="0" w:val="none"/>
+          <w:between w:color="000000" w:space="0" w:sz="0" w:val="none"/>
         </w:pBdr>
         <w:ind w:left="720" w:hanging="360"/>
+        <w:rPr/>
       </w:pPr>
       <w:r>
         <w:rPr>
@@ -2819,6 +2960,11 @@
           <w:rtl w:val="0"/>
         </w:rPr>
         <w:t xml:space="preserve"> Respeto absoluto del orden de precedencia (p. ej., No se planifica HU-03 sin haber completado la autenticación en HU-02).</w:t>
+      </w:r>
+      <w:r>
+        <w:rPr>
+          <w:rtl w:val="0"/>
+        </w:rPr>
       </w:r>
     </w:p>
     <w:p>
@@ -2828,12 +2974,13 @@
           <w:numId w:val="3"/>
         </w:numPr>
         <w:pBdr>
-          <w:top w:color="auto" w:space="0" w:sz="0" w:val="none"/>
-          <w:bottom w:color="auto" w:space="0" w:sz="0" w:val="none"/>
-          <w:right w:color="auto" w:space="0" w:sz="0" w:val="none"/>
-          <w:between w:color="auto" w:space="0" w:sz="0" w:val="none"/>
+          <w:top w:color="000000" w:space="0" w:sz="0" w:val="none"/>
+          <w:bottom w:color="000000" w:space="0" w:sz="0" w:val="none"/>
+          <w:right w:color="000000" w:space="0" w:sz="0" w:val="none"/>
+          <w:between w:color="000000" w:space="0" w:sz="0" w:val="none"/>
         </w:pBdr>
         <w:ind w:left="720" w:hanging="360"/>
+        <w:rPr/>
       </w:pPr>
       <w:r>
         <w:rPr>
@@ -2850,6 +2997,11 @@
           <w:rtl w:val="0"/>
         </w:rPr>
         <w:t xml:space="preserve"> Cada Sprint debe culminar con un incremento potencialmente desplegable que el Product Owner pueda probar.</w:t>
+      </w:r>
+      <w:r>
+        <w:rPr>
+          <w:rtl w:val="0"/>
+        </w:rPr>
       </w:r>
     </w:p>
     <w:p>
@@ -2859,12 +3011,13 @@
           <w:numId w:val="3"/>
         </w:numPr>
         <w:pBdr>
-          <w:top w:color="auto" w:space="0" w:sz="0" w:val="none"/>
-          <w:bottom w:color="auto" w:space="0" w:sz="0" w:val="none"/>
-          <w:right w:color="auto" w:space="0" w:sz="0" w:val="none"/>
-          <w:between w:color="auto" w:space="0" w:sz="0" w:val="none"/>
+          <w:top w:color="000000" w:space="0" w:sz="0" w:val="none"/>
+          <w:bottom w:color="000000" w:space="0" w:sz="0" w:val="none"/>
+          <w:right w:color="000000" w:space="0" w:sz="0" w:val="none"/>
+          <w:between w:color="000000" w:space="0" w:sz="0" w:val="none"/>
         </w:pBdr>
         <w:ind w:left="720" w:hanging="360"/>
+        <w:rPr/>
       </w:pPr>
       <w:r>
         <w:rPr>
@@ -2881,6 +3034,11 @@
           <w:rtl w:val="0"/>
         </w:rPr>
         <w:t xml:space="preserve"> Selección de historias cuyo desarrollo combinado apunte a una capacidad de negocio unificada.</w:t>
+      </w:r>
+      <w:r>
+        <w:rPr>
+          <w:rtl w:val="0"/>
+        </w:rPr>
       </w:r>
     </w:p>
     <w:p>
@@ -2890,12 +3048,13 @@
           <w:numId w:val="3"/>
         </w:numPr>
         <w:pBdr>
-          <w:top w:color="auto" w:space="0" w:sz="0" w:val="none"/>
-          <w:bottom w:color="auto" w:space="0" w:sz="0" w:val="none"/>
-          <w:right w:color="auto" w:space="0" w:sz="0" w:val="none"/>
-          <w:between w:color="auto" w:space="0" w:sz="0" w:val="none"/>
+          <w:top w:color="000000" w:space="0" w:sz="0" w:val="none"/>
+          <w:bottom w:color="000000" w:space="0" w:sz="0" w:val="none"/>
+          <w:right w:color="000000" w:space="0" w:sz="0" w:val="none"/>
+          <w:between w:color="000000" w:space="0" w:sz="0" w:val="none"/>
         </w:pBdr>
         <w:ind w:left="720" w:hanging="360"/>
+        <w:rPr/>
       </w:pPr>
       <w:r>
         <w:rPr>
@@ -2912,6 +3071,11 @@
           <w:rtl w:val="0"/>
         </w:rPr>
         <w:t xml:space="preserve"> Límite máximo de complejidad por PBI de 8 SP para evitar que una historia bloquee el cierre del Sprint.</w:t>
+      </w:r>
+      <w:r>
+        <w:rPr>
+          <w:rtl w:val="0"/>
+        </w:rPr>
       </w:r>
     </w:p>
     <w:p>
@@ -2921,12 +3085,13 @@
           <w:numId w:val="3"/>
         </w:numPr>
         <w:pBdr>
-          <w:top w:color="auto" w:space="0" w:sz="0" w:val="none"/>
-          <w:bottom w:color="auto" w:space="0" w:sz="0" w:val="none"/>
-          <w:right w:color="auto" w:space="0" w:sz="0" w:val="none"/>
-          <w:between w:color="auto" w:space="0" w:sz="0" w:val="none"/>
+          <w:top w:color="000000" w:space="0" w:sz="0" w:val="none"/>
+          <w:bottom w:color="000000" w:space="0" w:sz="0" w:val="none"/>
+          <w:right w:color="000000" w:space="0" w:sz="0" w:val="none"/>
+          <w:between w:color="000000" w:space="0" w:sz="0" w:val="none"/>
         </w:pBdr>
         <w:ind w:left="720" w:hanging="360"/>
+        <w:rPr/>
       </w:pPr>
       <w:r>
         <w:rPr>
@@ -2943,6 +3108,11 @@
           <w:rtl w:val="0"/>
         </w:rPr>
         <w:t xml:space="preserve"> Solo las historias con criterios de aceptación inambiguos y dependencias resueltas son candidatas para asignación.</w:t>
+      </w:r>
+      <w:r>
+        <w:rPr>
+          <w:rtl w:val="0"/>
+        </w:rPr>
       </w:r>
     </w:p>
     <w:p>
@@ -2963,11 +3133,11 @@
         <w:keepNext w:val="0"/>
         <w:keepLines w:val="0"/>
         <w:pBdr>
-          <w:top w:color="auto" w:space="0" w:sz="0" w:val="none"/>
-          <w:left w:color="auto" w:space="0" w:sz="0" w:val="none"/>
-          <w:bottom w:color="auto" w:space="0" w:sz="0" w:val="none"/>
-          <w:right w:color="auto" w:space="0" w:sz="0" w:val="none"/>
-          <w:between w:color="auto" w:space="0" w:sz="0" w:val="none"/>
+          <w:top w:color="000000" w:space="0" w:sz="0" w:val="none"/>
+          <w:left w:color="000000" w:space="0" w:sz="0" w:val="none"/>
+          <w:bottom w:color="000000" w:space="0" w:sz="0" w:val="none"/>
+          <w:right w:color="000000" w:space="0" w:sz="0" w:val="none"/>
+          <w:between w:color="000000" w:space="0" w:sz="0" w:val="none"/>
         </w:pBdr>
         <w:spacing w:after="0" w:before="0" w:lineRule="auto"/>
         <w:rPr>
@@ -2978,7 +3148,7 @@
           <w:szCs w:val="34"/>
         </w:rPr>
       </w:pPr>
-      <w:bookmarkStart w:colFirst="0" w:colLast="0" w:name="_enw8z0rdu7of" w:id="9"/>
+      <w:bookmarkStart w:colFirst="0" w:colLast="0" w:name="_heading=h.n4xshtrxp06s" w:id="9"/>
       <w:bookmarkEnd w:id="9"/>
       <w:r>
         <w:rPr>
@@ -3041,12 +3211,13 @@
           <w:numId w:val="4"/>
         </w:numPr>
         <w:pBdr>
-          <w:top w:color="auto" w:space="0" w:sz="0" w:val="none"/>
-          <w:bottom w:color="auto" w:space="0" w:sz="0" w:val="none"/>
-          <w:right w:color="auto" w:space="0" w:sz="0" w:val="none"/>
-          <w:between w:color="auto" w:space="0" w:sz="0" w:val="none"/>
+          <w:top w:color="000000" w:space="0" w:sz="0" w:val="none"/>
+          <w:bottom w:color="000000" w:space="0" w:sz="0" w:val="none"/>
+          <w:right w:color="000000" w:space="0" w:sz="0" w:val="none"/>
+          <w:between w:color="000000" w:space="0" w:sz="0" w:val="none"/>
         </w:pBdr>
         <w:ind w:left="720" w:hanging="360"/>
+        <w:rPr/>
       </w:pPr>
       <w:r>
         <w:rPr>
@@ -3063,6 +3234,11 @@
           <w:rtl w:val="0"/>
         </w:rPr>
         <w:t xml:space="preserve"> "Crear tabla usuarios, escribir endpoints y hacer el layout del login."</w:t>
+      </w:r>
+      <w:r>
+        <w:rPr>
+          <w:rtl w:val="0"/>
+        </w:rPr>
       </w:r>
     </w:p>
     <w:p>
@@ -3072,12 +3248,13 @@
           <w:numId w:val="4"/>
         </w:numPr>
         <w:pBdr>
-          <w:top w:color="auto" w:space="0" w:sz="0" w:val="none"/>
-          <w:bottom w:color="auto" w:space="0" w:sz="0" w:val="none"/>
-          <w:right w:color="auto" w:space="0" w:sz="0" w:val="none"/>
-          <w:between w:color="auto" w:space="0" w:sz="0" w:val="none"/>
+          <w:top w:color="000000" w:space="0" w:sz="0" w:val="none"/>
+          <w:bottom w:color="000000" w:space="0" w:sz="0" w:val="none"/>
+          <w:right w:color="000000" w:space="0" w:sz="0" w:val="none"/>
+          <w:between w:color="000000" w:space="0" w:sz="0" w:val="none"/>
         </w:pBdr>
         <w:ind w:left="720" w:hanging="360"/>
+        <w:rPr/>
       </w:pPr>
       <w:r>
         <w:rPr>
@@ -3094,6 +3271,11 @@
           <w:rtl w:val="0"/>
         </w:rPr>
         <w:t xml:space="preserve"> "Garantizar que un usuario pueda registrarse de forma segura e iniciar sesión obteniendo un token autenticado en la aplicación móvil."</w:t>
+      </w:r>
+      <w:r>
+        <w:rPr>
+          <w:rtl w:val="0"/>
+        </w:rPr>
       </w:r>
     </w:p>
     <w:p>
@@ -3110,7 +3292,7 @@
           <w:szCs w:val="46"/>
         </w:rPr>
       </w:pPr>
-      <w:bookmarkStart w:colFirst="0" w:colLast="0" w:name="_2ljak7kwm7fn" w:id="10"/>
+      <w:bookmarkStart w:colFirst="0" w:colLast="0" w:name="_heading=h.s0iy3kj2x4o5" w:id="10"/>
       <w:bookmarkEnd w:id="10"/>
       <w:r>
         <w:rPr>
@@ -3132,14 +3314,14 @@
     <w:p>
       <w:pPr>
         <w:pBdr>
-          <w:top w:color="auto" w:space="0" w:sz="0" w:val="none"/>
-          <w:left w:color="auto" w:space="0" w:sz="0" w:val="none"/>
-          <w:bottom w:color="auto" w:space="0" w:sz="0" w:val="none"/>
-          <w:right w:color="auto" w:space="0" w:sz="0" w:val="none"/>
-          <w:between w:color="auto" w:space="0" w:sz="0" w:val="none"/>
+          <w:top w:color="000000" w:space="0" w:sz="0" w:val="none"/>
+          <w:left w:color="000000" w:space="0" w:sz="0" w:val="none"/>
+          <w:bottom w:color="000000" w:space="0" w:sz="0" w:val="none"/>
+          <w:right w:color="000000" w:space="0" w:sz="0" w:val="none"/>
+          <w:between w:color="000000" w:space="0" w:sz="0" w:val="none"/>
         </w:pBdr>
         <w:shd w:fill="ffffff" w:val="clear"/>
-        <w:spacing w:after="100" w:line="259.20000000000005" w:lineRule="auto"/>
+        <w:spacing w:after="100" w:line="259.2000000000001" w:lineRule="auto"/>
         <w:ind w:left="0" w:firstLine="0"/>
         <w:rPr>
           <w:color w:val="1f1f1f"/>
@@ -3150,7 +3332,7 @@
           <w:color w:val="1f1f1f"/>
           <w:rtl w:val="0"/>
         </w:rPr>
-        <w:t>Esta Definition of Done es única para el proyecto: se aplica a todas las tarjetas y entregables de la Fase 1 y la Fase 2.</w:t>
+        <w:t xml:space="preserve">Esta Definition of Done es única para el proyecto: se aplica a todas las tarjetas y entregables de la Fase 1 y la Fase 2.</w:t>
       </w:r>
     </w:p>
     <w:p>
@@ -3164,11 +3346,11 @@
           <w:numId w:val="1"/>
         </w:numPr>
         <w:pBdr>
-          <w:top w:color="auto" w:space="0" w:sz="0" w:val="none"/>
+          <w:top w:color="000000" w:space="0" w:sz="0" w:val="none"/>
           <w:left w:space="0" w:sz="0" w:val="nil"/>
-          <w:bottom w:color="auto" w:space="0" w:sz="0" w:val="none"/>
-          <w:right w:color="auto" w:space="0" w:sz="0" w:val="none"/>
-          <w:between w:color="auto" w:space="0" w:sz="0" w:val="none"/>
+          <w:bottom w:color="000000" w:space="0" w:sz="0" w:val="none"/>
+          <w:right w:color="000000" w:space="0" w:sz="0" w:val="none"/>
+          <w:between w:color="000000" w:space="0" w:sz="0" w:val="none"/>
         </w:pBdr>
         <w:shd w:fill="auto" w:val="clear"/>
         <w:spacing w:after="0" w:before="0" w:line="276" w:lineRule="auto"/>
@@ -3197,11 +3379,11 @@
           <w:numId w:val="1"/>
         </w:numPr>
         <w:pBdr>
-          <w:top w:color="auto" w:space="0" w:sz="0" w:val="none"/>
+          <w:top w:color="000000" w:space="0" w:sz="0" w:val="none"/>
           <w:left w:space="0" w:sz="0" w:val="nil"/>
-          <w:bottom w:color="auto" w:space="0" w:sz="0" w:val="none"/>
-          <w:right w:color="auto" w:space="0" w:sz="0" w:val="none"/>
-          <w:between w:color="auto" w:space="0" w:sz="0" w:val="none"/>
+          <w:bottom w:color="000000" w:space="0" w:sz="0" w:val="none"/>
+          <w:right w:color="000000" w:space="0" w:sz="0" w:val="none"/>
+          <w:between w:color="000000" w:space="0" w:sz="0" w:val="none"/>
         </w:pBdr>
         <w:shd w:fill="auto" w:val="clear"/>
         <w:spacing w:after="0" w:before="0" w:line="276" w:lineRule="auto"/>
@@ -3230,11 +3412,11 @@
           <w:numId w:val="1"/>
         </w:numPr>
         <w:pBdr>
-          <w:top w:color="auto" w:space="0" w:sz="0" w:val="none"/>
+          <w:top w:color="000000" w:space="0" w:sz="0" w:val="none"/>
           <w:left w:space="0" w:sz="0" w:val="nil"/>
-          <w:bottom w:color="auto" w:space="0" w:sz="0" w:val="none"/>
-          <w:right w:color="auto" w:space="0" w:sz="0" w:val="none"/>
-          <w:between w:color="auto" w:space="0" w:sz="0" w:val="none"/>
+          <w:bottom w:color="000000" w:space="0" w:sz="0" w:val="none"/>
+          <w:right w:color="000000" w:space="0" w:sz="0" w:val="none"/>
+          <w:between w:color="000000" w:space="0" w:sz="0" w:val="none"/>
         </w:pBdr>
         <w:shd w:fill="auto" w:val="clear"/>
         <w:spacing w:after="0" w:before="0" w:line="276" w:lineRule="auto"/>
@@ -3263,11 +3445,11 @@
           <w:numId w:val="1"/>
         </w:numPr>
         <w:pBdr>
-          <w:top w:color="auto" w:space="0" w:sz="0" w:val="none"/>
+          <w:top w:color="000000" w:space="0" w:sz="0" w:val="none"/>
           <w:left w:space="0" w:sz="0" w:val="nil"/>
-          <w:bottom w:color="auto" w:space="0" w:sz="0" w:val="none"/>
-          <w:right w:color="auto" w:space="0" w:sz="0" w:val="none"/>
-          <w:between w:color="auto" w:space="0" w:sz="0" w:val="none"/>
+          <w:bottom w:color="000000" w:space="0" w:sz="0" w:val="none"/>
+          <w:right w:color="000000" w:space="0" w:sz="0" w:val="none"/>
+          <w:between w:color="000000" w:space="0" w:sz="0" w:val="none"/>
         </w:pBdr>
         <w:shd w:fill="auto" w:val="clear"/>
         <w:spacing w:after="0" w:before="0" w:line="276" w:lineRule="auto"/>
@@ -3296,11 +3478,11 @@
           <w:numId w:val="1"/>
         </w:numPr>
         <w:pBdr>
-          <w:top w:color="auto" w:space="0" w:sz="0" w:val="none"/>
+          <w:top w:color="000000" w:space="0" w:sz="0" w:val="none"/>
           <w:left w:space="0" w:sz="0" w:val="nil"/>
-          <w:bottom w:color="auto" w:space="0" w:sz="0" w:val="none"/>
-          <w:right w:color="auto" w:space="0" w:sz="0" w:val="none"/>
-          <w:between w:color="auto" w:space="0" w:sz="0" w:val="none"/>
+          <w:bottom w:color="000000" w:space="0" w:sz="0" w:val="none"/>
+          <w:right w:color="000000" w:space="0" w:sz="0" w:val="none"/>
+          <w:between w:color="000000" w:space="0" w:sz="0" w:val="none"/>
         </w:pBdr>
         <w:shd w:fill="auto" w:val="clear"/>
         <w:spacing w:after="0" w:before="0" w:line="276" w:lineRule="auto"/>
@@ -3329,11 +3511,11 @@
           <w:numId w:val="1"/>
         </w:numPr>
         <w:pBdr>
-          <w:top w:color="auto" w:space="0" w:sz="0" w:val="none"/>
+          <w:top w:color="000000" w:space="0" w:sz="0" w:val="none"/>
           <w:left w:space="0" w:sz="0" w:val="nil"/>
-          <w:bottom w:color="auto" w:space="0" w:sz="0" w:val="none"/>
-          <w:right w:color="auto" w:space="0" w:sz="0" w:val="none"/>
-          <w:between w:color="auto" w:space="0" w:sz="0" w:val="none"/>
+          <w:bottom w:color="000000" w:space="0" w:sz="0" w:val="none"/>
+          <w:right w:color="000000" w:space="0" w:sz="0" w:val="none"/>
+          <w:between w:color="000000" w:space="0" w:sz="0" w:val="none"/>
         </w:pBdr>
         <w:shd w:fill="auto" w:val="clear"/>
         <w:spacing w:after="0" w:before="0" w:line="276" w:lineRule="auto"/>
@@ -3362,11 +3544,11 @@
           <w:numId w:val="1"/>
         </w:numPr>
         <w:pBdr>
-          <w:top w:color="auto" w:space="0" w:sz="0" w:val="none"/>
+          <w:top w:color="000000" w:space="0" w:sz="0" w:val="none"/>
           <w:left w:space="0" w:sz="0" w:val="nil"/>
-          <w:bottom w:color="auto" w:space="0" w:sz="0" w:val="none"/>
-          <w:right w:color="auto" w:space="0" w:sz="0" w:val="none"/>
-          <w:between w:color="auto" w:space="0" w:sz="0" w:val="none"/>
+          <w:bottom w:color="000000" w:space="0" w:sz="0" w:val="none"/>
+          <w:right w:color="000000" w:space="0" w:sz="0" w:val="none"/>
+          <w:between w:color="000000" w:space="0" w:sz="0" w:val="none"/>
         </w:pBdr>
         <w:shd w:fill="auto" w:val="clear"/>
         <w:spacing w:after="0" w:before="0" w:line="276" w:lineRule="auto"/>
@@ -3395,11 +3577,11 @@
           <w:numId w:val="1"/>
         </w:numPr>
         <w:pBdr>
-          <w:top w:color="auto" w:space="0" w:sz="0" w:val="none"/>
+          <w:top w:color="000000" w:space="0" w:sz="0" w:val="none"/>
           <w:left w:space="0" w:sz="0" w:val="nil"/>
-          <w:bottom w:color="auto" w:space="0" w:sz="0" w:val="none"/>
-          <w:right w:color="auto" w:space="0" w:sz="0" w:val="none"/>
-          <w:between w:color="auto" w:space="0" w:sz="0" w:val="none"/>
+          <w:bottom w:color="000000" w:space="0" w:sz="0" w:val="none"/>
+          <w:right w:color="000000" w:space="0" w:sz="0" w:val="none"/>
+          <w:between w:color="000000" w:space="0" w:sz="0" w:val="none"/>
         </w:pBdr>
         <w:shd w:fill="auto" w:val="clear"/>
         <w:spacing w:after="0" w:before="0" w:line="276" w:lineRule="auto"/>
@@ -3416,6 +3598,28 @@
         </w:rPr>
         <w:t xml:space="preserve">La tarjeta queda marcada como completada solamente después de la validación correspondiente.</w:t>
       </w:r>
+    </w:p>
+    <w:p>
+      <w:pPr>
+        <w:keepNext w:val="0"/>
+        <w:keepLines w:val="0"/>
+        <w:pageBreakBefore w:val="0"/>
+        <w:widowControl w:val="1"/>
+        <w:pBdr>
+          <w:top w:color="000000" w:space="0" w:sz="0" w:val="none"/>
+          <w:left w:space="0" w:sz="0" w:val="nil"/>
+          <w:bottom w:color="000000" w:space="0" w:sz="0" w:val="none"/>
+          <w:right w:color="000000" w:space="0" w:sz="0" w:val="none"/>
+          <w:between w:color="000000" w:space="0" w:sz="0" w:val="none"/>
+        </w:pBdr>
+        <w:shd w:fill="auto" w:val="clear"/>
+        <w:spacing w:after="0" w:before="0" w:line="276" w:lineRule="auto"/>
+        <w:ind w:left="0" w:right="0" w:firstLine="0"/>
+        <w:jc w:val="left"/>
+        <w:rPr>
+          <w:color w:val="1f1f1f"/>
+        </w:rPr>
+      </w:pPr>
       <w:r>
         <w:rPr>
           <w:rtl w:val="0"/>
@@ -3440,11 +3644,11 @@
         <w:keepNext w:val="0"/>
         <w:keepLines w:val="0"/>
         <w:pBdr>
-          <w:top w:color="auto" w:space="0" w:sz="0" w:val="none"/>
-          <w:left w:color="auto" w:space="0" w:sz="0" w:val="none"/>
-          <w:bottom w:color="auto" w:space="0" w:sz="0" w:val="none"/>
-          <w:right w:color="auto" w:space="0" w:sz="0" w:val="none"/>
-          <w:between w:color="auto" w:space="0" w:sz="0" w:val="none"/>
+          <w:top w:color="000000" w:space="0" w:sz="0" w:val="none"/>
+          <w:left w:color="000000" w:space="0" w:sz="0" w:val="none"/>
+          <w:bottom w:color="000000" w:space="0" w:sz="0" w:val="none"/>
+          <w:right w:color="000000" w:space="0" w:sz="0" w:val="none"/>
+          <w:between w:color="000000" w:space="0" w:sz="0" w:val="none"/>
         </w:pBdr>
         <w:spacing w:after="0" w:before="0" w:lineRule="auto"/>
         <w:rPr>
@@ -3455,7 +3659,7 @@
           <w:szCs w:val="34"/>
         </w:rPr>
       </w:pPr>
-      <w:bookmarkStart w:colFirst="0" w:colLast="0" w:name="_94qb3djga82n" w:id="11"/>
+      <w:bookmarkStart w:colFirst="0" w:colLast="0" w:name="_heading=h.r9gc8a3op492" w:id="11"/>
       <w:bookmarkEnd w:id="11"/>
       <w:r>
         <w:rPr>
@@ -3544,12 +3748,13 @@
           <w:numId w:val="5"/>
         </w:numPr>
         <w:pBdr>
-          <w:top w:color="auto" w:space="0" w:sz="0" w:val="none"/>
-          <w:bottom w:color="auto" w:space="0" w:sz="0" w:val="none"/>
-          <w:right w:color="auto" w:space="0" w:sz="0" w:val="none"/>
-          <w:between w:color="auto" w:space="0" w:sz="0" w:val="none"/>
+          <w:top w:color="000000" w:space="0" w:sz="0" w:val="none"/>
+          <w:bottom w:color="000000" w:space="0" w:sz="0" w:val="none"/>
+          <w:right w:color="000000" w:space="0" w:sz="0" w:val="none"/>
+          <w:between w:color="000000" w:space="0" w:sz="0" w:val="none"/>
         </w:pBdr>
         <w:ind w:left="720" w:hanging="360"/>
+        <w:rPr/>
       </w:pPr>
       <w:r>
         <w:rPr>
@@ -3566,6 +3771,11 @@
           <w:rtl w:val="0"/>
         </w:rPr>
         <w:t xml:space="preserve"> Establece un horizonte claro de 5 semanas de trabajo donde los roles Scrum (PO, SM y Developers) comprenden el momento en que se entregará cada capacidad del sistema.</w:t>
+      </w:r>
+      <w:r>
+        <w:rPr>
+          <w:rtl w:val="0"/>
+        </w:rPr>
       </w:r>
     </w:p>
     <w:p>
@@ -3575,12 +3785,13 @@
           <w:numId w:val="5"/>
         </w:numPr>
         <w:pBdr>
-          <w:top w:color="auto" w:space="0" w:sz="0" w:val="none"/>
-          <w:bottom w:color="auto" w:space="0" w:sz="0" w:val="none"/>
-          <w:right w:color="auto" w:space="0" w:sz="0" w:val="none"/>
-          <w:between w:color="auto" w:space="0" w:sz="0" w:val="none"/>
+          <w:top w:color="000000" w:space="0" w:sz="0" w:val="none"/>
+          <w:bottom w:color="000000" w:space="0" w:sz="0" w:val="none"/>
+          <w:right w:color="000000" w:space="0" w:sz="0" w:val="none"/>
+          <w:between w:color="000000" w:space="0" w:sz="0" w:val="none"/>
         </w:pBdr>
         <w:ind w:left="720" w:hanging="360"/>
+        <w:rPr/>
       </w:pPr>
       <w:r>
         <w:rPr>
@@ -3597,6 +3808,11 @@
           <w:rtl w:val="0"/>
         </w:rPr>
         <w:t xml:space="preserve"> La consecución temprana del MVP en la Fase 2 (9 HUs: HU-01 a HU-08 y HU-14), preparada con la línea base entregada en el Sprint 4 de la Fase 1, mitiga el riesgo académico de llegar al proceso final sin un producto funcional demostrable.</w:t>
+      </w:r>
+      <w:r>
+        <w:rPr>
+          <w:rtl w:val="0"/>
+        </w:rPr>
       </w:r>
     </w:p>
     <w:p>
@@ -3606,12 +3822,13 @@
           <w:numId w:val="5"/>
         </w:numPr>
         <w:pBdr>
-          <w:top w:color="auto" w:space="0" w:sz="0" w:val="none"/>
-          <w:bottom w:color="auto" w:space="0" w:sz="0" w:val="none"/>
-          <w:right w:color="auto" w:space="0" w:sz="0" w:val="none"/>
-          <w:between w:color="auto" w:space="0" w:sz="0" w:val="none"/>
+          <w:top w:color="000000" w:space="0" w:sz="0" w:val="none"/>
+          <w:bottom w:color="000000" w:space="0" w:sz="0" w:val="none"/>
+          <w:right w:color="000000" w:space="0" w:sz="0" w:val="none"/>
+          <w:between w:color="000000" w:space="0" w:sz="0" w:val="none"/>
         </w:pBdr>
         <w:ind w:left="720" w:hanging="360"/>
+        <w:rPr/>
       </w:pPr>
       <w:r>
         <w:rPr>
@@ -3620,7 +3837,12 @@
           <w:color w:val="1f1f1f"/>
           <w:rtl w:val="0"/>
         </w:rPr>
-        <w:t>Nota de fechas: la entrega del Hito N°1 del Acta (11-09-2026) se realiza dentro del Sprint 4. La Sprint Review y la Retrospectiva del Sprint 4 se registraron el 14-09-2026, que es la fecha de cierre de la Fase 1.</w:t>
+        <w:t xml:space="preserve">Nota de fechas: la entrega del Hito N°1 del Acta (11-09-2026) se realiza dentro del Sprint 4. La Sprint Review y la Retrospectiva del Sprint 4 se registraron el 14-09-2026, que es la fecha de cierre de la Fase 1.</w:t>
+      </w:r>
+      <w:r>
+        <w:rPr>
+          <w:rtl w:val="0"/>
+        </w:rPr>
       </w:r>
     </w:p>
     <w:p>
@@ -3630,12 +3852,13 @@
           <w:numId w:val="5"/>
         </w:numPr>
         <w:pBdr>
-          <w:top w:color="auto" w:space="0" w:sz="0" w:val="none"/>
-          <w:bottom w:color="auto" w:space="0" w:sz="0" w:val="none"/>
-          <w:right w:color="auto" w:space="0" w:sz="0" w:val="none"/>
-          <w:between w:color="auto" w:space="0" w:sz="0" w:val="none"/>
+          <w:top w:color="000000" w:space="0" w:sz="0" w:val="none"/>
+          <w:bottom w:color="000000" w:space="0" w:sz="0" w:val="none"/>
+          <w:right w:color="000000" w:space="0" w:sz="0" w:val="none"/>
+          <w:between w:color="000000" w:space="0" w:sz="0" w:val="none"/>
         </w:pBdr>
         <w:ind w:left="720" w:hanging="360"/>
+        <w:rPr/>
       </w:pPr>
       <w:r>
         <w:rPr>
@@ -3652,6 +3875,11 @@
           <w:rtl w:val="0"/>
         </w:rPr>
         <w:t xml:space="preserve"> La asignación de Story Points respeta las limitaciones de tiempo de un equipo de tres Developers en un entorno universitario, evitando la sobrecarga de trabajo y la degradación de la calidad.</w:t>
+      </w:r>
+      <w:r>
+        <w:rPr>
+          <w:rtl w:val="0"/>
+        </w:rPr>
       </w:r>
     </w:p>
     <w:p>
@@ -3661,12 +3889,13 @@
           <w:numId w:val="5"/>
         </w:numPr>
         <w:pBdr>
-          <w:top w:color="auto" w:space="0" w:sz="0" w:val="none"/>
-          <w:bottom w:color="auto" w:space="0" w:sz="0" w:val="none"/>
-          <w:right w:color="auto" w:space="0" w:sz="0" w:val="none"/>
-          <w:between w:color="auto" w:space="0" w:sz="0" w:val="none"/>
+          <w:top w:color="000000" w:space="0" w:sz="0" w:val="none"/>
+          <w:bottom w:color="000000" w:space="0" w:sz="0" w:val="none"/>
+          <w:right w:color="000000" w:space="0" w:sz="0" w:val="none"/>
+          <w:between w:color="000000" w:space="0" w:sz="0" w:val="none"/>
         </w:pBdr>
         <w:ind w:left="720" w:hanging="360"/>
+        <w:rPr/>
       </w:pPr>
       <w:r>
         <w:rPr>
@@ -3684,14 +3913,19 @@
         </w:rPr>
         <w:t xml:space="preserve"> Al tratarse de un pronóstico adaptativo, el marco establecido permite reajustar las proyecciones mediante la velocidad observada y la información recopilada en cada sesión de Retrospectiva y Refinamiento.</w:t>
       </w:r>
-    </w:p>
-    <w:p>
-      <w:pPr>
-        <w:pBdr>
-          <w:top w:color="auto" w:space="0" w:sz="0" w:val="none"/>
-          <w:bottom w:color="auto" w:space="0" w:sz="0" w:val="none"/>
-          <w:right w:color="auto" w:space="0" w:sz="0" w:val="none"/>
-          <w:between w:color="auto" w:space="0" w:sz="0" w:val="none"/>
+      <w:r>
+        <w:rPr>
+          <w:rtl w:val="0"/>
+        </w:rPr>
+      </w:r>
+    </w:p>
+    <w:p>
+      <w:pPr>
+        <w:pBdr>
+          <w:top w:color="000000" w:space="0" w:sz="0" w:val="none"/>
+          <w:bottom w:color="000000" w:space="0" w:sz="0" w:val="none"/>
+          <w:right w:color="000000" w:space="0" w:sz="0" w:val="none"/>
+          <w:between w:color="000000" w:space="0" w:sz="0" w:val="none"/>
         </w:pBdr>
         <w:ind w:left="0" w:firstLine="0"/>
         <w:rPr>
@@ -3710,11 +3944,11 @@
         <w:keepNext w:val="0"/>
         <w:keepLines w:val="0"/>
         <w:pBdr>
-          <w:top w:color="auto" w:space="0" w:sz="0" w:val="none"/>
-          <w:left w:color="auto" w:space="0" w:sz="0" w:val="none"/>
-          <w:bottom w:color="auto" w:space="0" w:sz="0" w:val="none"/>
-          <w:right w:color="auto" w:space="0" w:sz="0" w:val="none"/>
-          <w:between w:color="auto" w:space="0" w:sz="0" w:val="none"/>
+          <w:top w:color="000000" w:space="0" w:sz="0" w:val="none"/>
+          <w:left w:color="000000" w:space="0" w:sz="0" w:val="none"/>
+          <w:bottom w:color="000000" w:space="0" w:sz="0" w:val="none"/>
+          <w:right w:color="000000" w:space="0" w:sz="0" w:val="none"/>
+          <w:between w:color="000000" w:space="0" w:sz="0" w:val="none"/>
         </w:pBdr>
         <w:spacing w:after="0" w:before="0" w:lineRule="auto"/>
         <w:rPr>
@@ -3725,7 +3959,7 @@
           <w:szCs w:val="34"/>
         </w:rPr>
       </w:pPr>
-      <w:bookmarkStart w:colFirst="0" w:colLast="0" w:name="_yn2unzn7imy9" w:id="12"/>
+      <w:bookmarkStart w:colFirst="0" w:colLast="0" w:name="_heading=h.4q8pimlili6d" w:id="12"/>
       <w:bookmarkEnd w:id="12"/>
       <w:r>
         <w:rPr>
@@ -3746,12 +3980,13 @@
           <w:numId w:val="2"/>
         </w:numPr>
         <w:pBdr>
-          <w:top w:color="auto" w:space="0" w:sz="0" w:val="none"/>
-          <w:bottom w:color="auto" w:space="0" w:sz="0" w:val="none"/>
-          <w:right w:color="auto" w:space="0" w:sz="0" w:val="none"/>
-          <w:between w:color="auto" w:space="0" w:sz="0" w:val="none"/>
+          <w:top w:color="000000" w:space="0" w:sz="0" w:val="none"/>
+          <w:bottom w:color="000000" w:space="0" w:sz="0" w:val="none"/>
+          <w:right w:color="000000" w:space="0" w:sz="0" w:val="none"/>
+          <w:between w:color="000000" w:space="0" w:sz="0" w:val="none"/>
         </w:pBdr>
         <w:ind w:left="720" w:hanging="360"/>
+        <w:rPr/>
       </w:pPr>
       <w:r>
         <w:rPr>
@@ -3784,6 +4019,11 @@
           <w:rtl w:val="0"/>
         </w:rPr>
         <w:t xml:space="preserve">. Addison-Wesley Professional.</w:t>
+      </w:r>
+      <w:r>
+        <w:rPr>
+          <w:rtl w:val="0"/>
+        </w:rPr>
       </w:r>
     </w:p>
     <w:p>
@@ -3793,12 +4033,13 @@
           <w:numId w:val="2"/>
         </w:numPr>
         <w:pBdr>
-          <w:top w:color="auto" w:space="0" w:sz="0" w:val="none"/>
-          <w:bottom w:color="auto" w:space="0" w:sz="0" w:val="none"/>
-          <w:right w:color="auto" w:space="0" w:sz="0" w:val="none"/>
-          <w:between w:color="auto" w:space="0" w:sz="0" w:val="none"/>
+          <w:top w:color="000000" w:space="0" w:sz="0" w:val="none"/>
+          <w:bottom w:color="000000" w:space="0" w:sz="0" w:val="none"/>
+          <w:right w:color="000000" w:space="0" w:sz="0" w:val="none"/>
+          <w:between w:color="000000" w:space="0" w:sz="0" w:val="none"/>
         </w:pBdr>
         <w:ind w:left="720" w:hanging="360"/>
+        <w:rPr/>
       </w:pPr>
       <w:r>
         <w:rPr>
@@ -3831,6 +4072,11 @@
           <w:rtl w:val="0"/>
         </w:rPr>
         <w:t xml:space="preserve">. Addison-Wesley.</w:t>
+      </w:r>
+      <w:r>
+        <w:rPr>
+          <w:rtl w:val="0"/>
+        </w:rPr>
       </w:r>
     </w:p>
     <w:p>
@@ -3840,12 +4086,13 @@
           <w:numId w:val="2"/>
         </w:numPr>
         <w:pBdr>
-          <w:top w:color="auto" w:space="0" w:sz="0" w:val="none"/>
-          <w:bottom w:color="auto" w:space="0" w:sz="0" w:val="none"/>
-          <w:right w:color="auto" w:space="0" w:sz="0" w:val="none"/>
-          <w:between w:color="auto" w:space="0" w:sz="0" w:val="none"/>
+          <w:top w:color="000000" w:space="0" w:sz="0" w:val="none"/>
+          <w:bottom w:color="000000" w:space="0" w:sz="0" w:val="none"/>
+          <w:right w:color="000000" w:space="0" w:sz="0" w:val="none"/>
+          <w:between w:color="000000" w:space="0" w:sz="0" w:val="none"/>
         </w:pBdr>
         <w:ind w:left="720" w:hanging="360"/>
+        <w:rPr/>
       </w:pPr>
       <w:r>
         <w:rPr>
@@ -3879,6 +4126,11 @@
         </w:rPr>
         <w:t xml:space="preserve">. Scrum.org.</w:t>
       </w:r>
+      <w:r>
+        <w:rPr>
+          <w:rtl w:val="0"/>
+        </w:rPr>
+      </w:r>
     </w:p>
     <w:p>
       <w:pPr>
@@ -3891,7 +4143,7 @@
       </w:r>
     </w:p>
     <w:sectPr>
-      <w:headerReference r:id="rId6" w:type="default"/>
+      <w:headerReference r:id="rId7" w:type="default"/>
       <w:pgSz w:h="16834" w:w="11909" w:orient="portrait"/>
       <w:pgMar w:bottom="1440" w:top="1440" w:left="1440" w:right="1440" w:header="720" w:footer="720"/>
       <w:pgNumType w:start="1"/>
@@ -4984,24 +5236,33 @@
       <w:szCs w:val="52"/>
     </w:rPr>
   </w:style>
-  <w:style w:type="paragraph" w:styleId="Subtitle">
-    <w:name w:val="Subtitle"/>
-    <w:basedOn w:val="Normal"/>
-    <w:next w:val="Normal"/>
-    <w:pPr>
-      <w:keepNext w:val="1"/>
-      <w:keepLines w:val="1"/>
-      <w:pageBreakBefore w:val="0"/>
-      <w:spacing w:after="320" w:before="0" w:lineRule="auto"/>
-    </w:pPr>
-    <w:rPr>
-      <w:rFonts w:ascii="Arial" w:cs="Arial" w:eastAsia="Arial" w:hAnsi="Arial"/>
-      <w:i w:val="0"/>
-      <w:iCs w:val="0"/>
-      <w:color w:val="666666"/>
-      <w:sz w:val="30"/>
-      <w:szCs w:val="30"/>
-    </w:rPr>
+  <w:style w:type="table" w:styleId="TableNormal" w:default="1">
+    <w:name w:val="TableNormal"/>
+    <w:tblPr>
+      <w:tblCellMar>
+        <w:top w:w="100.0" w:type="dxa"/>
+        <w:left w:w="100.0" w:type="dxa"/>
+        <w:bottom w:w="100.0" w:type="dxa"/>
+        <w:right w:w="100.0" w:type="dxa"/>
+      </w:tblCellMar>
+    </w:tblPr>
+  </w:style>
+  <w:style w:type="paragraph" w:styleId="Normal" w:default="1">
+    <w:name w:val="normal"/>
+  </w:style>
+  <w:style w:type="table" w:styleId="TableNormal" w:default="1">
+    <w:name w:val="TableNormal"/>
+    <w:tblPr>
+      <w:tblCellMar>
+        <w:top w:w="100.0" w:type="dxa"/>
+        <w:left w:w="100.0" w:type="dxa"/>
+        <w:bottom w:w="100.0" w:type="dxa"/>
+        <w:right w:w="100.0" w:type="dxa"/>
+      </w:tblCellMar>
+    </w:tblPr>
+  </w:style>
+  <w:style w:type="paragraph" w:styleId="Normal" w:default="1">
+    <w:name w:val="normal"/>
   </w:style>
   <w:style w:type="table" w:styleId="Table1">
     <w:basedOn w:val="TableNormal"/>
@@ -5096,6 +5357,89 @@
     <w:tblStylePr w:type="swCell">
       <w:tcPr/>
     </w:tblStylePr>
+  </w:style>
+  <w:style w:type="table" w:styleId="Table1">
+    <w:basedOn w:val="TableNormal"/>
+    <w:tblPr>
+      <w:tblStyleRowBandSize w:val="1"/>
+      <w:tblStyleColBandSize w:val="1"/>
+      <w:tblCellMar>
+        <w:top w:w="0.0" w:type="dxa"/>
+        <w:left w:w="115.0" w:type="dxa"/>
+        <w:bottom w:w="0.0" w:type="dxa"/>
+        <w:right w:w="115.0" w:type="dxa"/>
+      </w:tblCellMar>
+    </w:tblPr>
+    <w:tcPr>
+      <w:shd w:fill="ffffff" w:val="clear"/>
+    </w:tcPr>
+  </w:style>
+  <w:style w:type="table" w:styleId="Table2">
+    <w:basedOn w:val="TableNormal"/>
+    <w:tblPr>
+      <w:tblStyleRowBandSize w:val="1"/>
+      <w:tblStyleColBandSize w:val="1"/>
+      <w:tblCellMar>
+        <w:top w:w="0.0" w:type="dxa"/>
+        <w:left w:w="115.0" w:type="dxa"/>
+        <w:bottom w:w="0.0" w:type="dxa"/>
+        <w:right w:w="115.0" w:type="dxa"/>
+      </w:tblCellMar>
+    </w:tblPr>
+    <w:tcPr>
+      <w:shd w:fill="ffffff" w:val="clear"/>
+    </w:tcPr>
+  </w:style>
+  <w:style w:type="paragraph" w:styleId="Subtitle">
+    <w:name w:val="Subtitle"/>
+    <w:basedOn w:val="Normal"/>
+    <w:next w:val="Normal"/>
+    <w:pPr>
+      <w:keepNext w:val="1"/>
+      <w:keepLines w:val="1"/>
+      <w:pageBreakBefore w:val="0"/>
+      <w:spacing w:after="320" w:before="0" w:lineRule="auto"/>
+    </w:pPr>
+    <w:rPr>
+      <w:rFonts w:ascii="Arial" w:cs="Arial" w:eastAsia="Arial" w:hAnsi="Arial"/>
+      <w:i w:val="0"/>
+      <w:iCs w:val="0"/>
+      <w:color w:val="666666"/>
+      <w:sz w:val="30"/>
+      <w:szCs w:val="30"/>
+    </w:rPr>
+  </w:style>
+  <w:style w:type="table" w:styleId="Table1">
+    <w:basedOn w:val="TableNormal"/>
+    <w:tblPr>
+      <w:tblStyleRowBandSize w:val="1"/>
+      <w:tblStyleColBandSize w:val="1"/>
+      <w:tblCellMar>
+        <w:top w:w="0.0" w:type="dxa"/>
+        <w:left w:w="115.0" w:type="dxa"/>
+        <w:bottom w:w="0.0" w:type="dxa"/>
+        <w:right w:w="115.0" w:type="dxa"/>
+      </w:tblCellMar>
+    </w:tblPr>
+    <w:tcPr>
+      <w:shd w:fill="ffffff" w:val="clear"/>
+    </w:tcPr>
+  </w:style>
+  <w:style w:type="table" w:styleId="Table2">
+    <w:basedOn w:val="TableNormal"/>
+    <w:tblPr>
+      <w:tblStyleRowBandSize w:val="1"/>
+      <w:tblStyleColBandSize w:val="1"/>
+      <w:tblCellMar>
+        <w:top w:w="0.0" w:type="dxa"/>
+        <w:left w:w="115.0" w:type="dxa"/>
+        <w:bottom w:w="0.0" w:type="dxa"/>
+        <w:right w:w="115.0" w:type="dxa"/>
+      </w:tblCellMar>
+    </w:tblPr>
+    <w:tcPr>
+      <w:shd w:fill="ffffff" w:val="clear"/>
+    </w:tcPr>
   </w:style>
 </w:styles>
 </file>
@@ -5418,4 +5762,19 @@
   </a:objectDefaults>
   <a:extraClrSchemeLst/>
 </a:theme>
+</file>
+
+<file path=customXML/item1.xml><?xml version="1.0" encoding="utf-8"?>
+<go:gDocsCustomXmlDataStorage xmlns:go="http://customooxmlschemas.google.com/" xmlns:r="http://schemas.openxmlformats.org/officeDocument/2006/relationships" uri="GoogleDocsCustomDataVersion2">
+  <go:docsCustomData xmlns:go="http://customooxmlschemas.google.com/" roundtripDataSignature="AMtx7mhI0pRaxBWa7WsAmIKf+oS72Xc5Qw==">CgMxLjAyDmgubXVxc3gyN3N0bXVxMg5oLm9lNTZsaTFvZDV6ejIOaC40dm5qbXl1MWFxdDQyDmguN2Fhb3QxejR0eWN1Mg5oLng2cmdoY3VrMm1uaTIOaC5zOWpkNzBicGh2eTgyDmgudGJ2Mmpjb2xwZ3EzMg5oLjdmNmw0eWl1bHdraTIOaC5ibnR5cG9sbWVnYTAyDmgubjR4c2h0cnhwMDZzMg5oLnMwaXkza2oyeDRvNTIOaC5yOWdjOGEzb3A0OTIyDmguNHE4cGltbGlsaTZkOAByITFRT0Fmb3Fob25iaDFxYlJhc2x2TTROU090MkE5TWJzeA==</go:docsCustomData>
+</go:gDocsCustomXmlDataStorage>
+</file>
+
+<file path=customXML/itemProps1.xml><?xml version="1.0" encoding="utf-8"?>
+<ds:datastoreItem xmlns:ds="http://schemas.openxmlformats.org/officeDocument/2006/customXml" ds:itemID="{11111111-1234-1234-1234-123412341234}">
+  <ds:schemaRefs>
+    <ds:schemaRef ds:uri="http://schemas.openxmlformats.org/officeDocument/2006/relationships"/>
+    <ds:schemaRef ds:uri="http://customooxmlschemas.google.com/"/>
+  </ds:schemaRefs>
+</ds:datastoreItem>
 </file>
</xml_diff>